<commit_message>
Add Claude Platform Mastery campus-manager project and course files
Adds campus-manager sample project, new contract/timeline docx files,
session materials, and skills demo. Moves Session3 lab guide into
Prompt-Engineering-and-Evaluation. Ignores node_modules and Office
temp/lock files going forward.
</commit_message>
<xml_diff>
--- a/Training/files/CCA_Syllabus.docx
+++ b/Training/files/CCA_Syllabus.docx
@@ -1,6 +1,6 @@
 
 <file path=word/document.xml><?xml version="1.0" encoding="utf-8"?>
-<w:document xmlns:wpc="http://schemas.microsoft.com/office/word/2010/wordprocessingCanvas" xmlns:cx="http://schemas.microsoft.com/office/drawing/2014/chartex" xmlns:cx1="http://schemas.microsoft.com/office/drawing/2015/9/8/chartex" xmlns:cx2="http://schemas.microsoft.com/office/drawing/2015/10/21/chartex" xmlns:cx3="http://schemas.microsoft.com/office/drawing/2016/5/9/chartex" xmlns:cx4="http://schemas.microsoft.com/office/drawing/2016/5/10/chartex" xmlns:cx5="http://schemas.microsoft.com/office/drawing/2016/5/11/chartex" xmlns:cx6="http://schemas.microsoft.com/office/drawing/2016/5/12/chartex" xmlns:cx7="http://schemas.microsoft.com/office/drawing/2016/5/13/chartex" xmlns:cx8="http://schemas.microsoft.com/office/drawing/2016/5/14/chartex" xmlns:mc="http://schemas.openxmlformats.org/markup-compatibility/2006" xmlns:aink="http://schemas.microsoft.com/office/drawing/2016/ink" xmlns:am3d="http://schemas.microsoft.com/office/drawing/2017/model3d" xmlns:o="urn:schemas-microsoft-com:office:office" xmlns:oel="http://schemas.microsoft.com/office/2019/extlst" xmlns:r="http://schemas.openxmlformats.org/officeDocument/2006/relationships" xmlns:m="http://schemas.openxmlformats.org/officeDocument/2006/math" xmlns:v="urn:schemas-microsoft-com:vml" xmlns:wp14="http://schemas.microsoft.com/office/word/2010/wordprocessingDrawing" xmlns:wp="http://schemas.openxmlformats.org/drawingml/2006/wordprocessingDrawing" xmlns:w10="urn:schemas-microsoft-com:office:word" xmlns:w="http://schemas.openxmlformats.org/wordprocessingml/2006/main" xmlns:w14="http://schemas.microsoft.com/office/word/2010/wordml" xmlns:w15="http://schemas.microsoft.com/office/word/2012/wordml" xmlns:w16cex="http://schemas.microsoft.com/office/word/2018/wordml/cex" xmlns:w16cid="http://schemas.microsoft.com/office/word/2016/wordml/cid" xmlns:w16="http://schemas.microsoft.com/office/word/2018/wordml" xmlns:w16du="http://schemas.microsoft.com/office/word/2023/wordml/word16du" xmlns:w16sdtdh="http://schemas.microsoft.com/office/word/2020/wordml/sdtdatahash" xmlns:w16sdtfl="http://schemas.microsoft.com/office/word/2024/wordml/sdtformatlock" xmlns:w16se="http://schemas.microsoft.com/office/word/2015/wordml/symex" xmlns:wpg="http://schemas.microsoft.com/office/word/2010/wordprocessingGroup" xmlns:wpi="http://schemas.microsoft.com/office/word/2010/wordprocessingInk" xmlns:wne="http://schemas.microsoft.com/office/word/2006/wordml" xmlns:wps="http://schemas.microsoft.com/office/word/2010/wordprocessingShape" mc:Ignorable="w14 w15 w16se w16cid w16 w16cex w16sdtdh w16sdtfl w16du wp14">
+<w:document xmlns:wpc="http://schemas.microsoft.com/office/word/2010/wordprocessingCanvas" xmlns:cx="http://schemas.microsoft.com/office/drawing/2014/chartex" xmlns:cx1="http://schemas.microsoft.com/office/drawing/2015/9/8/chartex" xmlns:cx2="http://schemas.microsoft.com/office/drawing/2015/10/21/chartex" xmlns:cx3="http://schemas.microsoft.com/office/drawing/2016/5/9/chartex" xmlns:cx4="http://schemas.microsoft.com/office/drawing/2016/5/10/chartex" xmlns:cx5="http://schemas.microsoft.com/office/drawing/2016/5/11/chartex" xmlns:cx6="http://schemas.microsoft.com/office/drawing/2016/5/12/chartex" xmlns:cx7="http://schemas.microsoft.com/office/drawing/2016/5/13/chartex" xmlns:cx8="http://schemas.microsoft.com/office/drawing/2016/5/14/chartex" xmlns:mc="http://schemas.openxmlformats.org/markup-compatibility/2006" xmlns:aink="http://schemas.microsoft.com/office/drawing/2016/ink" xmlns:am3d="http://schemas.microsoft.com/office/drawing/2017/model3d" xmlns:o="urn:schemas-microsoft-com:office:office" xmlns:oel="http://schemas.microsoft.com/office/2019/extlst" xmlns:r="http://schemas.openxmlformats.org/officeDocument/2006/relationships" xmlns:m="http://schemas.openxmlformats.org/officeDocument/2006/math" xmlns:v="urn:schemas-microsoft-com:vml" xmlns:wp14="http://schemas.microsoft.com/office/word/2010/wordprocessingDrawing" xmlns:wp="http://schemas.openxmlformats.org/drawingml/2006/wordprocessingDrawing" xmlns:w10="urn:schemas-microsoft-com:office:word" xmlns:w="http://schemas.openxmlformats.org/wordprocessingml/2006/main" xmlns:w14="http://schemas.microsoft.com/office/word/2010/wordml" xmlns:w15="http://schemas.microsoft.com/office/word/2012/wordml" xmlns:w16cei="http://schemas.microsoft.com/office/word/2026/wordml/cei" xmlns:w16cex="http://schemas.microsoft.com/office/word/2018/wordml/cex" xmlns:w16cid="http://schemas.microsoft.com/office/word/2016/wordml/cid" xmlns:w16="http://schemas.microsoft.com/office/word/2018/wordml" xmlns:w16du="http://schemas.microsoft.com/office/word/2023/wordml/word16du" xmlns:w16sdtdh="http://schemas.microsoft.com/office/word/2020/wordml/sdtdatahash" xmlns:w16sdtfl="http://schemas.microsoft.com/office/word/2024/wordml/sdtformatlock" xmlns:w16se="http://schemas.microsoft.com/office/word/2015/wordml/symex" xmlns:wpg="http://schemas.microsoft.com/office/word/2010/wordprocessingGroup" xmlns:wpi="http://schemas.microsoft.com/office/word/2010/wordprocessingInk" xmlns:wne="http://schemas.microsoft.com/office/word/2006/wordml" xmlns:wps="http://schemas.microsoft.com/office/word/2010/wordprocessingShape" mc:Ignorable="w14 w15 w16se w16cid w16 w16cex w16sdtdh w16sdtfl w16du wp14">
   <w:body>
     <w:p>
       <w:pPr>
@@ -72,12 +72,6 @@
         <w:gridCol w:w="2340"/>
       </w:tblGrid>
       <w:tr>
-        <w:tblPrEx>
-          <w:tblCellMar>
-            <w:top w:w="0" w:type="dxa"/>
-            <w:bottom w:w="0" w:type="dxa"/>
-          </w:tblCellMar>
-        </w:tblPrEx>
         <w:tc>
           <w:tcPr>
             <w:tcW w:w="2340" w:type="dxa"/>
@@ -170,17 +164,7 @@
                 <w:sz w:val="22"/>
                 <w:szCs w:val="22"/>
               </w:rPr>
-              <w:t>40</w:t>
-            </w:r>
-            <w:r>
-              <w:rPr>
-                <w:b/>
-                <w:bCs/>
-                <w:color w:val="FFFFFF"/>
-                <w:sz w:val="22"/>
-                <w:szCs w:val="22"/>
-              </w:rPr>
-              <w:t>+ Hours</w:t>
+              <w:t>40+ Hours</w:t>
             </w:r>
           </w:p>
         </w:tc>
@@ -647,12 +631,6 @@
         <w:gridCol w:w="1360"/>
       </w:tblGrid>
       <w:tr>
-        <w:tblPrEx>
-          <w:tblCellMar>
-            <w:top w:w="0" w:type="dxa"/>
-            <w:bottom w:w="0" w:type="dxa"/>
-          </w:tblCellMar>
-        </w:tblPrEx>
         <w:tc>
           <w:tcPr>
             <w:tcW w:w="2000" w:type="dxa"/>
@@ -739,12 +717,6 @@
         </w:tc>
       </w:tr>
       <w:tr>
-        <w:tblPrEx>
-          <w:tblCellMar>
-            <w:top w:w="0" w:type="dxa"/>
-            <w:bottom w:w="0" w:type="dxa"/>
-          </w:tblCellMar>
-        </w:tblPrEx>
         <w:tc>
           <w:tcPr>
             <w:tcW w:w="2000" w:type="dxa"/>
@@ -831,12 +803,6 @@
         </w:tc>
       </w:tr>
       <w:tr>
-        <w:tblPrEx>
-          <w:tblCellMar>
-            <w:top w:w="0" w:type="dxa"/>
-            <w:bottom w:w="0" w:type="dxa"/>
-          </w:tblCellMar>
-        </w:tblPrEx>
         <w:tc>
           <w:tcPr>
             <w:tcW w:w="2000" w:type="dxa"/>
@@ -918,12 +884,6 @@
         </w:tc>
       </w:tr>
       <w:tr>
-        <w:tblPrEx>
-          <w:tblCellMar>
-            <w:top w:w="0" w:type="dxa"/>
-            <w:bottom w:w="0" w:type="dxa"/>
-          </w:tblCellMar>
-        </w:tblPrEx>
         <w:tc>
           <w:tcPr>
             <w:tcW w:w="2000" w:type="dxa"/>
@@ -1010,12 +970,6 @@
         </w:tc>
       </w:tr>
       <w:tr>
-        <w:tblPrEx>
-          <w:tblCellMar>
-            <w:top w:w="0" w:type="dxa"/>
-            <w:bottom w:w="0" w:type="dxa"/>
-          </w:tblCellMar>
-        </w:tblPrEx>
         <w:tc>
           <w:tcPr>
             <w:tcW w:w="2000" w:type="dxa"/>
@@ -1102,12 +1056,6 @@
         </w:tc>
       </w:tr>
       <w:tr>
-        <w:tblPrEx>
-          <w:tblCellMar>
-            <w:top w:w="0" w:type="dxa"/>
-            <w:bottom w:w="0" w:type="dxa"/>
-          </w:tblCellMar>
-        </w:tblPrEx>
         <w:tc>
           <w:tcPr>
             <w:tcW w:w="2000" w:type="dxa"/>
@@ -1272,12 +1220,6 @@
         <w:gridCol w:w="1360"/>
       </w:tblGrid>
       <w:tr>
-        <w:tblPrEx>
-          <w:tblCellMar>
-            <w:top w:w="0" w:type="dxa"/>
-            <w:bottom w:w="0" w:type="dxa"/>
-          </w:tblCellMar>
-        </w:tblPrEx>
         <w:tc>
           <w:tcPr>
             <w:tcW w:w="2000" w:type="dxa"/>
@@ -1364,12 +1306,6 @@
         </w:tc>
       </w:tr>
       <w:tr>
-        <w:tblPrEx>
-          <w:tblCellMar>
-            <w:top w:w="0" w:type="dxa"/>
-            <w:bottom w:w="0" w:type="dxa"/>
-          </w:tblCellMar>
-        </w:tblPrEx>
         <w:tc>
           <w:tcPr>
             <w:tcW w:w="2000" w:type="dxa"/>
@@ -1456,12 +1392,6 @@
         </w:tc>
       </w:tr>
       <w:tr>
-        <w:tblPrEx>
-          <w:tblCellMar>
-            <w:top w:w="0" w:type="dxa"/>
-            <w:bottom w:w="0" w:type="dxa"/>
-          </w:tblCellMar>
-        </w:tblPrEx>
         <w:tc>
           <w:tcPr>
             <w:tcW w:w="2000" w:type="dxa"/>
@@ -1548,12 +1478,6 @@
         </w:tc>
       </w:tr>
       <w:tr>
-        <w:tblPrEx>
-          <w:tblCellMar>
-            <w:top w:w="0" w:type="dxa"/>
-            <w:bottom w:w="0" w:type="dxa"/>
-          </w:tblCellMar>
-        </w:tblPrEx>
         <w:tc>
           <w:tcPr>
             <w:tcW w:w="2000" w:type="dxa"/>
@@ -1640,12 +1564,6 @@
         </w:tc>
       </w:tr>
       <w:tr>
-        <w:tblPrEx>
-          <w:tblCellMar>
-            <w:top w:w="0" w:type="dxa"/>
-            <w:bottom w:w="0" w:type="dxa"/>
-          </w:tblCellMar>
-        </w:tblPrEx>
         <w:tc>
           <w:tcPr>
             <w:tcW w:w="2000" w:type="dxa"/>
@@ -1732,12 +1650,6 @@
         </w:tc>
       </w:tr>
       <w:tr>
-        <w:tblPrEx>
-          <w:tblCellMar>
-            <w:top w:w="0" w:type="dxa"/>
-            <w:bottom w:w="0" w:type="dxa"/>
-          </w:tblCellMar>
-        </w:tblPrEx>
         <w:tc>
           <w:tcPr>
             <w:tcW w:w="2000" w:type="dxa"/>
@@ -1824,12 +1736,6 @@
         </w:tc>
       </w:tr>
       <w:tr>
-        <w:tblPrEx>
-          <w:tblCellMar>
-            <w:top w:w="0" w:type="dxa"/>
-            <w:bottom w:w="0" w:type="dxa"/>
-          </w:tblCellMar>
-        </w:tblPrEx>
         <w:tc>
           <w:tcPr>
             <w:tcW w:w="2000" w:type="dxa"/>
@@ -1974,12 +1880,6 @@
         <w:gridCol w:w="1360"/>
       </w:tblGrid>
       <w:tr>
-        <w:tblPrEx>
-          <w:tblCellMar>
-            <w:top w:w="0" w:type="dxa"/>
-            <w:bottom w:w="0" w:type="dxa"/>
-          </w:tblCellMar>
-        </w:tblPrEx>
         <w:tc>
           <w:tcPr>
             <w:tcW w:w="2000" w:type="dxa"/>
@@ -2066,12 +1966,6 @@
         </w:tc>
       </w:tr>
       <w:tr>
-        <w:tblPrEx>
-          <w:tblCellMar>
-            <w:top w:w="0" w:type="dxa"/>
-            <w:bottom w:w="0" w:type="dxa"/>
-          </w:tblCellMar>
-        </w:tblPrEx>
         <w:tc>
           <w:tcPr>
             <w:tcW w:w="2000" w:type="dxa"/>
@@ -2158,12 +2052,6 @@
         </w:tc>
       </w:tr>
       <w:tr>
-        <w:tblPrEx>
-          <w:tblCellMar>
-            <w:top w:w="0" w:type="dxa"/>
-            <w:bottom w:w="0" w:type="dxa"/>
-          </w:tblCellMar>
-        </w:tblPrEx>
         <w:tc>
           <w:tcPr>
             <w:tcW w:w="2000" w:type="dxa"/>
@@ -2250,12 +2138,6 @@
         </w:tc>
       </w:tr>
       <w:tr>
-        <w:tblPrEx>
-          <w:tblCellMar>
-            <w:top w:w="0" w:type="dxa"/>
-            <w:bottom w:w="0" w:type="dxa"/>
-          </w:tblCellMar>
-        </w:tblPrEx>
         <w:tc>
           <w:tcPr>
             <w:tcW w:w="2000" w:type="dxa"/>
@@ -2342,12 +2224,6 @@
         </w:tc>
       </w:tr>
       <w:tr>
-        <w:tblPrEx>
-          <w:tblCellMar>
-            <w:top w:w="0" w:type="dxa"/>
-            <w:bottom w:w="0" w:type="dxa"/>
-          </w:tblCellMar>
-        </w:tblPrEx>
         <w:tc>
           <w:tcPr>
             <w:tcW w:w="2000" w:type="dxa"/>
@@ -2434,12 +2310,6 @@
         </w:tc>
       </w:tr>
       <w:tr>
-        <w:tblPrEx>
-          <w:tblCellMar>
-            <w:top w:w="0" w:type="dxa"/>
-            <w:bottom w:w="0" w:type="dxa"/>
-          </w:tblCellMar>
-        </w:tblPrEx>
         <w:tc>
           <w:tcPr>
             <w:tcW w:w="2000" w:type="dxa"/>
@@ -2527,12 +2397,6 @@
         </w:tc>
       </w:tr>
       <w:tr>
-        <w:tblPrEx>
-          <w:tblCellMar>
-            <w:top w:w="0" w:type="dxa"/>
-            <w:bottom w:w="0" w:type="dxa"/>
-          </w:tblCellMar>
-        </w:tblPrEx>
         <w:tc>
           <w:tcPr>
             <w:tcW w:w="2000" w:type="dxa"/>
@@ -2698,12 +2562,6 @@
         <w:gridCol w:w="1360"/>
       </w:tblGrid>
       <w:tr>
-        <w:tblPrEx>
-          <w:tblCellMar>
-            <w:top w:w="0" w:type="dxa"/>
-            <w:bottom w:w="0" w:type="dxa"/>
-          </w:tblCellMar>
-        </w:tblPrEx>
         <w:tc>
           <w:tcPr>
             <w:tcW w:w="2000" w:type="dxa"/>
@@ -2790,12 +2648,6 @@
         </w:tc>
       </w:tr>
       <w:tr>
-        <w:tblPrEx>
-          <w:tblCellMar>
-            <w:top w:w="0" w:type="dxa"/>
-            <w:bottom w:w="0" w:type="dxa"/>
-          </w:tblCellMar>
-        </w:tblPrEx>
         <w:tc>
           <w:tcPr>
             <w:tcW w:w="2000" w:type="dxa"/>
@@ -2882,12 +2734,6 @@
         </w:tc>
       </w:tr>
       <w:tr>
-        <w:tblPrEx>
-          <w:tblCellMar>
-            <w:top w:w="0" w:type="dxa"/>
-            <w:bottom w:w="0" w:type="dxa"/>
-          </w:tblCellMar>
-        </w:tblPrEx>
         <w:tc>
           <w:tcPr>
             <w:tcW w:w="2000" w:type="dxa"/>
@@ -2974,12 +2820,6 @@
         </w:tc>
       </w:tr>
       <w:tr>
-        <w:tblPrEx>
-          <w:tblCellMar>
-            <w:top w:w="0" w:type="dxa"/>
-            <w:bottom w:w="0" w:type="dxa"/>
-          </w:tblCellMar>
-        </w:tblPrEx>
         <w:tc>
           <w:tcPr>
             <w:tcW w:w="2000" w:type="dxa"/>
@@ -3066,12 +2906,6 @@
         </w:tc>
       </w:tr>
       <w:tr>
-        <w:tblPrEx>
-          <w:tblCellMar>
-            <w:top w:w="0" w:type="dxa"/>
-            <w:bottom w:w="0" w:type="dxa"/>
-          </w:tblCellMar>
-        </w:tblPrEx>
         <w:tc>
           <w:tcPr>
             <w:tcW w:w="2000" w:type="dxa"/>
@@ -3158,12 +2992,6 @@
         </w:tc>
       </w:tr>
       <w:tr>
-        <w:tblPrEx>
-          <w:tblCellMar>
-            <w:top w:w="0" w:type="dxa"/>
-            <w:bottom w:w="0" w:type="dxa"/>
-          </w:tblCellMar>
-        </w:tblPrEx>
         <w:tc>
           <w:tcPr>
             <w:tcW w:w="2000" w:type="dxa"/>
@@ -3250,12 +3078,6 @@
         </w:tc>
       </w:tr>
       <w:tr>
-        <w:tblPrEx>
-          <w:tblCellMar>
-            <w:top w:w="0" w:type="dxa"/>
-            <w:bottom w:w="0" w:type="dxa"/>
-          </w:tblCellMar>
-        </w:tblPrEx>
         <w:tc>
           <w:tcPr>
             <w:tcW w:w="2000" w:type="dxa"/>
@@ -3342,12 +3164,6 @@
         </w:tc>
       </w:tr>
       <w:tr>
-        <w:tblPrEx>
-          <w:tblCellMar>
-            <w:top w:w="0" w:type="dxa"/>
-            <w:bottom w:w="0" w:type="dxa"/>
-          </w:tblCellMar>
-        </w:tblPrEx>
         <w:tc>
           <w:tcPr>
             <w:tcW w:w="2000" w:type="dxa"/>
@@ -3434,12 +3250,6 @@
         </w:tc>
       </w:tr>
       <w:tr>
-        <w:tblPrEx>
-          <w:tblCellMar>
-            <w:top w:w="0" w:type="dxa"/>
-            <w:bottom w:w="0" w:type="dxa"/>
-          </w:tblCellMar>
-        </w:tblPrEx>
         <w:tc>
           <w:tcPr>
             <w:tcW w:w="2000" w:type="dxa"/>
@@ -3604,12 +3414,6 @@
         <w:gridCol w:w="1360"/>
       </w:tblGrid>
       <w:tr>
-        <w:tblPrEx>
-          <w:tblCellMar>
-            <w:top w:w="0" w:type="dxa"/>
-            <w:bottom w:w="0" w:type="dxa"/>
-          </w:tblCellMar>
-        </w:tblPrEx>
         <w:tc>
           <w:tcPr>
             <w:tcW w:w="2000" w:type="dxa"/>
@@ -3696,12 +3500,6 @@
         </w:tc>
       </w:tr>
       <w:tr>
-        <w:tblPrEx>
-          <w:tblCellMar>
-            <w:top w:w="0" w:type="dxa"/>
-            <w:bottom w:w="0" w:type="dxa"/>
-          </w:tblCellMar>
-        </w:tblPrEx>
         <w:tc>
           <w:tcPr>
             <w:tcW w:w="2000" w:type="dxa"/>
@@ -3788,12 +3586,6 @@
         </w:tc>
       </w:tr>
       <w:tr>
-        <w:tblPrEx>
-          <w:tblCellMar>
-            <w:top w:w="0" w:type="dxa"/>
-            <w:bottom w:w="0" w:type="dxa"/>
-          </w:tblCellMar>
-        </w:tblPrEx>
         <w:tc>
           <w:tcPr>
             <w:tcW w:w="2000" w:type="dxa"/>
@@ -3880,12 +3672,6 @@
         </w:tc>
       </w:tr>
       <w:tr>
-        <w:tblPrEx>
-          <w:tblCellMar>
-            <w:top w:w="0" w:type="dxa"/>
-            <w:bottom w:w="0" w:type="dxa"/>
-          </w:tblCellMar>
-        </w:tblPrEx>
         <w:tc>
           <w:tcPr>
             <w:tcW w:w="2000" w:type="dxa"/>
@@ -3972,12 +3758,6 @@
         </w:tc>
       </w:tr>
       <w:tr>
-        <w:tblPrEx>
-          <w:tblCellMar>
-            <w:top w:w="0" w:type="dxa"/>
-            <w:bottom w:w="0" w:type="dxa"/>
-          </w:tblCellMar>
-        </w:tblPrEx>
         <w:trPr>
           <w:trHeight w:val="431"/>
         </w:trPr>
@@ -4067,12 +3847,6 @@
         </w:tc>
       </w:tr>
       <w:tr>
-        <w:tblPrEx>
-          <w:tblCellMar>
-            <w:top w:w="0" w:type="dxa"/>
-            <w:bottom w:w="0" w:type="dxa"/>
-          </w:tblCellMar>
-        </w:tblPrEx>
         <w:tc>
           <w:tcPr>
             <w:tcW w:w="2000" w:type="dxa"/>
@@ -4237,12 +4011,6 @@
         <w:gridCol w:w="1360"/>
       </w:tblGrid>
       <w:tr>
-        <w:tblPrEx>
-          <w:tblCellMar>
-            <w:top w:w="0" w:type="dxa"/>
-            <w:bottom w:w="0" w:type="dxa"/>
-          </w:tblCellMar>
-        </w:tblPrEx>
         <w:tc>
           <w:tcPr>
             <w:tcW w:w="2000" w:type="dxa"/>
@@ -4329,12 +4097,6 @@
         </w:tc>
       </w:tr>
       <w:tr>
-        <w:tblPrEx>
-          <w:tblCellMar>
-            <w:top w:w="0" w:type="dxa"/>
-            <w:bottom w:w="0" w:type="dxa"/>
-          </w:tblCellMar>
-        </w:tblPrEx>
         <w:tc>
           <w:tcPr>
             <w:tcW w:w="2000" w:type="dxa"/>
@@ -4421,12 +4183,6 @@
         </w:tc>
       </w:tr>
       <w:tr>
-        <w:tblPrEx>
-          <w:tblCellMar>
-            <w:top w:w="0" w:type="dxa"/>
-            <w:bottom w:w="0" w:type="dxa"/>
-          </w:tblCellMar>
-        </w:tblPrEx>
         <w:tc>
           <w:tcPr>
             <w:tcW w:w="2000" w:type="dxa"/>
@@ -4513,12 +4269,6 @@
         </w:tc>
       </w:tr>
       <w:tr>
-        <w:tblPrEx>
-          <w:tblCellMar>
-            <w:top w:w="0" w:type="dxa"/>
-            <w:bottom w:w="0" w:type="dxa"/>
-          </w:tblCellMar>
-        </w:tblPrEx>
         <w:tc>
           <w:tcPr>
             <w:tcW w:w="2000" w:type="dxa"/>
@@ -4605,12 +4355,6 @@
         </w:tc>
       </w:tr>
       <w:tr>
-        <w:tblPrEx>
-          <w:tblCellMar>
-            <w:top w:w="0" w:type="dxa"/>
-            <w:bottom w:w="0" w:type="dxa"/>
-          </w:tblCellMar>
-        </w:tblPrEx>
         <w:tc>
           <w:tcPr>
             <w:tcW w:w="2000" w:type="dxa"/>
@@ -4697,12 +4441,6 @@
         </w:tc>
       </w:tr>
       <w:tr>
-        <w:tblPrEx>
-          <w:tblCellMar>
-            <w:top w:w="0" w:type="dxa"/>
-            <w:bottom w:w="0" w:type="dxa"/>
-          </w:tblCellMar>
-        </w:tblPrEx>
         <w:tc>
           <w:tcPr>
             <w:tcW w:w="2000" w:type="dxa"/>
@@ -4789,12 +4527,6 @@
         </w:tc>
       </w:tr>
       <w:tr>
-        <w:tblPrEx>
-          <w:tblCellMar>
-            <w:top w:w="0" w:type="dxa"/>
-            <w:bottom w:w="0" w:type="dxa"/>
-          </w:tblCellMar>
-        </w:tblPrEx>
         <w:tc>
           <w:tcPr>
             <w:tcW w:w="2000" w:type="dxa"/>
@@ -4960,12 +4692,6 @@
         <w:gridCol w:w="1360"/>
       </w:tblGrid>
       <w:tr>
-        <w:tblPrEx>
-          <w:tblCellMar>
-            <w:top w:w="0" w:type="dxa"/>
-            <w:bottom w:w="0" w:type="dxa"/>
-          </w:tblCellMar>
-        </w:tblPrEx>
         <w:tc>
           <w:tcPr>
             <w:tcW w:w="2000" w:type="dxa"/>
@@ -5052,12 +4778,6 @@
         </w:tc>
       </w:tr>
       <w:tr>
-        <w:tblPrEx>
-          <w:tblCellMar>
-            <w:top w:w="0" w:type="dxa"/>
-            <w:bottom w:w="0" w:type="dxa"/>
-          </w:tblCellMar>
-        </w:tblPrEx>
         <w:tc>
           <w:tcPr>
             <w:tcW w:w="2000" w:type="dxa"/>
@@ -5144,12 +4864,6 @@
         </w:tc>
       </w:tr>
       <w:tr>
-        <w:tblPrEx>
-          <w:tblCellMar>
-            <w:top w:w="0" w:type="dxa"/>
-            <w:bottom w:w="0" w:type="dxa"/>
-          </w:tblCellMar>
-        </w:tblPrEx>
         <w:tc>
           <w:tcPr>
             <w:tcW w:w="2000" w:type="dxa"/>
@@ -5236,12 +4950,6 @@
         </w:tc>
       </w:tr>
       <w:tr>
-        <w:tblPrEx>
-          <w:tblCellMar>
-            <w:top w:w="0" w:type="dxa"/>
-            <w:bottom w:w="0" w:type="dxa"/>
-          </w:tblCellMar>
-        </w:tblPrEx>
         <w:tc>
           <w:tcPr>
             <w:tcW w:w="2000" w:type="dxa"/>
@@ -5328,12 +5036,6 @@
         </w:tc>
       </w:tr>
       <w:tr>
-        <w:tblPrEx>
-          <w:tblCellMar>
-            <w:top w:w="0" w:type="dxa"/>
-            <w:bottom w:w="0" w:type="dxa"/>
-          </w:tblCellMar>
-        </w:tblPrEx>
         <w:tc>
           <w:tcPr>
             <w:tcW w:w="2000" w:type="dxa"/>
@@ -5420,12 +5122,6 @@
         </w:tc>
       </w:tr>
       <w:tr>
-        <w:tblPrEx>
-          <w:tblCellMar>
-            <w:top w:w="0" w:type="dxa"/>
-            <w:bottom w:w="0" w:type="dxa"/>
-          </w:tblCellMar>
-        </w:tblPrEx>
         <w:tc>
           <w:tcPr>
             <w:tcW w:w="2000" w:type="dxa"/>
@@ -5512,12 +5208,6 @@
         </w:tc>
       </w:tr>
       <w:tr>
-        <w:tblPrEx>
-          <w:tblCellMar>
-            <w:top w:w="0" w:type="dxa"/>
-            <w:bottom w:w="0" w:type="dxa"/>
-          </w:tblCellMar>
-        </w:tblPrEx>
         <w:tc>
           <w:tcPr>
             <w:tcW w:w="2000" w:type="dxa"/>
@@ -5604,12 +5294,6 @@
         </w:tc>
       </w:tr>
       <w:tr>
-        <w:tblPrEx>
-          <w:tblCellMar>
-            <w:top w:w="0" w:type="dxa"/>
-            <w:bottom w:w="0" w:type="dxa"/>
-          </w:tblCellMar>
-        </w:tblPrEx>
         <w:tc>
           <w:tcPr>
             <w:tcW w:w="2000" w:type="dxa"/>
@@ -5754,12 +5438,6 @@
         <w:gridCol w:w="1360"/>
       </w:tblGrid>
       <w:tr>
-        <w:tblPrEx>
-          <w:tblCellMar>
-            <w:top w:w="0" w:type="dxa"/>
-            <w:bottom w:w="0" w:type="dxa"/>
-          </w:tblCellMar>
-        </w:tblPrEx>
         <w:tc>
           <w:tcPr>
             <w:tcW w:w="2000" w:type="dxa"/>
@@ -5846,12 +5524,6 @@
         </w:tc>
       </w:tr>
       <w:tr>
-        <w:tblPrEx>
-          <w:tblCellMar>
-            <w:top w:w="0" w:type="dxa"/>
-            <w:bottom w:w="0" w:type="dxa"/>
-          </w:tblCellMar>
-        </w:tblPrEx>
         <w:tc>
           <w:tcPr>
             <w:tcW w:w="2000" w:type="dxa"/>
@@ -5938,12 +5610,6 @@
         </w:tc>
       </w:tr>
       <w:tr>
-        <w:tblPrEx>
-          <w:tblCellMar>
-            <w:top w:w="0" w:type="dxa"/>
-            <w:bottom w:w="0" w:type="dxa"/>
-          </w:tblCellMar>
-        </w:tblPrEx>
         <w:tc>
           <w:tcPr>
             <w:tcW w:w="2000" w:type="dxa"/>
@@ -6030,12 +5696,6 @@
         </w:tc>
       </w:tr>
       <w:tr>
-        <w:tblPrEx>
-          <w:tblCellMar>
-            <w:top w:w="0" w:type="dxa"/>
-            <w:bottom w:w="0" w:type="dxa"/>
-          </w:tblCellMar>
-        </w:tblPrEx>
         <w:tc>
           <w:tcPr>
             <w:tcW w:w="2000" w:type="dxa"/>
@@ -6122,12 +5782,6 @@
         </w:tc>
       </w:tr>
       <w:tr>
-        <w:tblPrEx>
-          <w:tblCellMar>
-            <w:top w:w="0" w:type="dxa"/>
-            <w:bottom w:w="0" w:type="dxa"/>
-          </w:tblCellMar>
-        </w:tblPrEx>
         <w:tc>
           <w:tcPr>
             <w:tcW w:w="2000" w:type="dxa"/>
@@ -6214,12 +5868,6 @@
         </w:tc>
       </w:tr>
       <w:tr>
-        <w:tblPrEx>
-          <w:tblCellMar>
-            <w:top w:w="0" w:type="dxa"/>
-            <w:bottom w:w="0" w:type="dxa"/>
-          </w:tblCellMar>
-        </w:tblPrEx>
         <w:tc>
           <w:tcPr>
             <w:tcW w:w="2000" w:type="dxa"/>
@@ -6306,12 +5954,6 @@
         </w:tc>
       </w:tr>
       <w:tr>
-        <w:tblPrEx>
-          <w:tblCellMar>
-            <w:top w:w="0" w:type="dxa"/>
-            <w:bottom w:w="0" w:type="dxa"/>
-          </w:tblCellMar>
-        </w:tblPrEx>
         <w:tc>
           <w:tcPr>
             <w:tcW w:w="2000" w:type="dxa"/>
@@ -6398,12 +6040,6 @@
         </w:tc>
       </w:tr>
       <w:tr>
-        <w:tblPrEx>
-          <w:tblCellMar>
-            <w:top w:w="0" w:type="dxa"/>
-            <w:bottom w:w="0" w:type="dxa"/>
-          </w:tblCellMar>
-        </w:tblPrEx>
         <w:tc>
           <w:tcPr>
             <w:tcW w:w="2000" w:type="dxa"/>
@@ -6568,12 +6204,6 @@
         <w:gridCol w:w="1360"/>
       </w:tblGrid>
       <w:tr>
-        <w:tblPrEx>
-          <w:tblCellMar>
-            <w:top w:w="0" w:type="dxa"/>
-            <w:bottom w:w="0" w:type="dxa"/>
-          </w:tblCellMar>
-        </w:tblPrEx>
         <w:tc>
           <w:tcPr>
             <w:tcW w:w="2000" w:type="dxa"/>
@@ -6660,12 +6290,6 @@
         </w:tc>
       </w:tr>
       <w:tr>
-        <w:tblPrEx>
-          <w:tblCellMar>
-            <w:top w:w="0" w:type="dxa"/>
-            <w:bottom w:w="0" w:type="dxa"/>
-          </w:tblCellMar>
-        </w:tblPrEx>
         <w:tc>
           <w:tcPr>
             <w:tcW w:w="2000" w:type="dxa"/>
@@ -6752,12 +6376,6 @@
         </w:tc>
       </w:tr>
       <w:tr>
-        <w:tblPrEx>
-          <w:tblCellMar>
-            <w:top w:w="0" w:type="dxa"/>
-            <w:bottom w:w="0" w:type="dxa"/>
-          </w:tblCellMar>
-        </w:tblPrEx>
         <w:tc>
           <w:tcPr>
             <w:tcW w:w="2000" w:type="dxa"/>
@@ -6844,12 +6462,6 @@
         </w:tc>
       </w:tr>
       <w:tr>
-        <w:tblPrEx>
-          <w:tblCellMar>
-            <w:top w:w="0" w:type="dxa"/>
-            <w:bottom w:w="0" w:type="dxa"/>
-          </w:tblCellMar>
-        </w:tblPrEx>
         <w:tc>
           <w:tcPr>
             <w:tcW w:w="2000" w:type="dxa"/>
@@ -6936,12 +6548,6 @@
         </w:tc>
       </w:tr>
       <w:tr>
-        <w:tblPrEx>
-          <w:tblCellMar>
-            <w:top w:w="0" w:type="dxa"/>
-            <w:bottom w:w="0" w:type="dxa"/>
-          </w:tblCellMar>
-        </w:tblPrEx>
         <w:tc>
           <w:tcPr>
             <w:tcW w:w="2000" w:type="dxa"/>
@@ -7028,12 +6634,6 @@
         </w:tc>
       </w:tr>
       <w:tr>
-        <w:tblPrEx>
-          <w:tblCellMar>
-            <w:top w:w="0" w:type="dxa"/>
-            <w:bottom w:w="0" w:type="dxa"/>
-          </w:tblCellMar>
-        </w:tblPrEx>
         <w:tc>
           <w:tcPr>
             <w:tcW w:w="2000" w:type="dxa"/>
@@ -7135,10 +6735,7 @@
         <w:pStyle w:val="Heading1"/>
       </w:pPr>
       <w:r>
-        <w:t>3</w:t>
-      </w:r>
-      <w:r>
-        <w:t>. Resources</w:t>
+        <w:t>3. Resources</w:t>
       </w:r>
     </w:p>
     <w:p>
@@ -7239,7 +6836,23 @@
           <w:sz w:val="18"/>
           <w:szCs w:val="18"/>
         </w:rPr>
-        <w:t>$10 API credit included for lab exercises</w:t>
+        <w:t>$</w:t>
+      </w:r>
+      <w:r>
+        <w:rPr>
+          <w:color w:val="6B7280"/>
+          <w:sz w:val="18"/>
+          <w:szCs w:val="18"/>
+        </w:rPr>
+        <w:t>5</w:t>
+      </w:r>
+      <w:r>
+        <w:rPr>
+          <w:color w:val="6B7280"/>
+          <w:sz w:val="18"/>
+          <w:szCs w:val="18"/>
+        </w:rPr>
+        <w:t xml:space="preserve"> API credit included for lab exercises</w:t>
       </w:r>
     </w:p>
     <w:p>
@@ -7342,14 +6955,2527 @@
         </w:pBdr>
         <w:spacing w:before="240" w:after="80"/>
         <w:jc w:val="center"/>
-      </w:pPr>
-      <w:r>
         <w:rPr>
           <w:color w:val="9CA3AF"/>
           <w:sz w:val="16"/>
           <w:szCs w:val="16"/>
         </w:rPr>
+      </w:pPr>
+      <w:r>
+        <w:rPr>
+          <w:color w:val="9CA3AF"/>
+          <w:sz w:val="16"/>
+          <w:szCs w:val="16"/>
+        </w:rPr>
         <w:t>Claude Certified Architect  |  Anthropic Professional Training  |  v2.0 2025</w:t>
+      </w:r>
+    </w:p>
+    <w:p>
+      <w:pPr>
+        <w:pBdr>
+          <w:top w:val="single" w:sz="4" w:space="8" w:color="D1D5DB"/>
+        </w:pBdr>
+        <w:spacing w:before="240" w:after="80"/>
+        <w:jc w:val="center"/>
+        <w:rPr>
+          <w:color w:val="9CA3AF"/>
+          <w:sz w:val="16"/>
+          <w:szCs w:val="16"/>
+        </w:rPr>
+      </w:pPr>
+    </w:p>
+    <w:p>
+      <w:pPr>
+        <w:pBdr>
+          <w:top w:val="single" w:sz="4" w:space="8" w:color="D1D5DB"/>
+        </w:pBdr>
+        <w:spacing w:before="240" w:after="80"/>
+        <w:jc w:val="center"/>
+        <w:rPr>
+          <w:color w:val="9CA3AF"/>
+          <w:sz w:val="16"/>
+          <w:szCs w:val="16"/>
+        </w:rPr>
+      </w:pPr>
+    </w:p>
+    <w:p>
+      <w:pPr>
+        <w:pBdr>
+          <w:top w:val="single" w:sz="4" w:space="8" w:color="D1D5DB"/>
+        </w:pBdr>
+        <w:spacing w:before="240" w:after="80"/>
+        <w:jc w:val="center"/>
+        <w:rPr>
+          <w:color w:val="9CA3AF"/>
+          <w:sz w:val="16"/>
+          <w:szCs w:val="16"/>
+        </w:rPr>
+      </w:pPr>
+    </w:p>
+    <w:p>
+      <w:pPr>
+        <w:pBdr>
+          <w:top w:val="single" w:sz="4" w:space="8" w:color="D1D5DB"/>
+        </w:pBdr>
+        <w:spacing w:before="240" w:after="80"/>
+      </w:pPr>
+      <w:r>
+        <w:t>AI System Design</w:t>
+      </w:r>
+    </w:p>
+    <w:p>
+      <w:pPr>
+        <w:pBdr>
+          <w:top w:val="single" w:sz="4" w:space="8" w:color="D1D5DB"/>
+        </w:pBdr>
+        <w:spacing w:before="240" w:after="80"/>
+        <w:jc w:val="center"/>
+      </w:pPr>
+      <w:r>
+        <w:drawing>
+          <wp:inline distT="0" distB="0" distL="0" distR="0" wp14:anchorId="35BE2B6B" wp14:editId="1449591C">
+            <wp:extent cx="5943600" cy="1585595"/>
+            <wp:effectExtent l="0" t="0" r="0" b="0"/>
+            <wp:docPr id="167074947" name="Picture 1"/>
+            <wp:cNvGraphicFramePr>
+              <a:graphicFrameLocks xmlns:a="http://schemas.openxmlformats.org/drawingml/2006/main" noChangeAspect="1"/>
+            </wp:cNvGraphicFramePr>
+            <a:graphic xmlns:a="http://schemas.openxmlformats.org/drawingml/2006/main">
+              <a:graphicData uri="http://schemas.openxmlformats.org/drawingml/2006/picture">
+                <pic:pic xmlns:pic="http://schemas.openxmlformats.org/drawingml/2006/picture">
+                  <pic:nvPicPr>
+                    <pic:cNvPr id="167074947" name=""/>
+                    <pic:cNvPicPr/>
+                  </pic:nvPicPr>
+                  <pic:blipFill>
+                    <a:blip r:embed="rId5"/>
+                    <a:stretch>
+                      <a:fillRect/>
+                    </a:stretch>
+                  </pic:blipFill>
+                  <pic:spPr>
+                    <a:xfrm>
+                      <a:off x="0" y="0"/>
+                      <a:ext cx="5943600" cy="1585595"/>
+                    </a:xfrm>
+                    <a:prstGeom prst="rect">
+                      <a:avLst/>
+                    </a:prstGeom>
+                  </pic:spPr>
+                </pic:pic>
+              </a:graphicData>
+            </a:graphic>
+          </wp:inline>
+        </w:drawing>
+      </w:r>
+    </w:p>
+    <w:p>
+      <w:pPr>
+        <w:pBdr>
+          <w:top w:val="single" w:sz="4" w:space="8" w:color="D1D5DB"/>
+        </w:pBdr>
+        <w:spacing w:before="240" w:after="80"/>
+      </w:pPr>
+    </w:p>
+    <w:p>
+      <w:pPr>
+        <w:pBdr>
+          <w:top w:val="single" w:sz="4" w:space="8" w:color="D1D5DB"/>
+        </w:pBdr>
+        <w:spacing w:before="240" w:after="80"/>
+      </w:pPr>
+    </w:p>
+    <w:p>
+      <w:pPr>
+        <w:pBdr>
+          <w:top w:val="single" w:sz="4" w:space="8" w:color="D1D5DB"/>
+        </w:pBdr>
+        <w:spacing w:before="240" w:after="80"/>
+      </w:pPr>
+    </w:p>
+    <w:p>
+      <w:pPr>
+        <w:pBdr>
+          <w:top w:val="single" w:sz="4" w:space="8" w:color="D1D5DB"/>
+        </w:pBdr>
+        <w:spacing w:before="240" w:after="80"/>
+      </w:pPr>
+    </w:p>
+    <w:p>
+      <w:pPr>
+        <w:pBdr>
+          <w:top w:val="single" w:sz="4" w:space="8" w:color="D1D5DB"/>
+        </w:pBdr>
+        <w:spacing w:before="240" w:after="80"/>
+      </w:pPr>
+      <w:r>
+        <w:lastRenderedPageBreak/>
+        <w:t>Models:</w:t>
+      </w:r>
+    </w:p>
+    <w:p>
+      <w:pPr>
+        <w:pBdr>
+          <w:top w:val="single" w:sz="4" w:space="8" w:color="D1D5DB"/>
+        </w:pBdr>
+        <w:spacing w:before="240" w:after="80"/>
+      </w:pPr>
+    </w:p>
+    <w:p>
+      <w:pPr>
+        <w:pBdr>
+          <w:top w:val="single" w:sz="4" w:space="8" w:color="D1D5DB"/>
+        </w:pBdr>
+        <w:spacing w:before="240" w:after="80"/>
+      </w:pPr>
+      <w:r>
+        <w:drawing>
+          <wp:inline distT="0" distB="0" distL="0" distR="0" wp14:anchorId="167427AF" wp14:editId="012321B8">
+            <wp:extent cx="5006774" cy="2408129"/>
+            <wp:effectExtent l="0" t="0" r="3810" b="0"/>
+            <wp:docPr id="112884366" name="Picture 1"/>
+            <wp:cNvGraphicFramePr>
+              <a:graphicFrameLocks xmlns:a="http://schemas.openxmlformats.org/drawingml/2006/main" noChangeAspect="1"/>
+            </wp:cNvGraphicFramePr>
+            <a:graphic xmlns:a="http://schemas.openxmlformats.org/drawingml/2006/main">
+              <a:graphicData uri="http://schemas.openxmlformats.org/drawingml/2006/picture">
+                <pic:pic xmlns:pic="http://schemas.openxmlformats.org/drawingml/2006/picture">
+                  <pic:nvPicPr>
+                    <pic:cNvPr id="112884366" name=""/>
+                    <pic:cNvPicPr/>
+                  </pic:nvPicPr>
+                  <pic:blipFill>
+                    <a:blip r:embed="rId6"/>
+                    <a:stretch>
+                      <a:fillRect/>
+                    </a:stretch>
+                  </pic:blipFill>
+                  <pic:spPr>
+                    <a:xfrm>
+                      <a:off x="0" y="0"/>
+                      <a:ext cx="5006774" cy="2408129"/>
+                    </a:xfrm>
+                    <a:prstGeom prst="rect">
+                      <a:avLst/>
+                    </a:prstGeom>
+                  </pic:spPr>
+                </pic:pic>
+              </a:graphicData>
+            </a:graphic>
+          </wp:inline>
+        </w:drawing>
+      </w:r>
+    </w:p>
+    <w:p>
+      <w:pPr>
+        <w:pBdr>
+          <w:top w:val="single" w:sz="4" w:space="8" w:color="D1D5DB"/>
+        </w:pBdr>
+        <w:spacing w:before="240" w:after="80"/>
+        <w:jc w:val="center"/>
+      </w:pPr>
+    </w:p>
+    <w:p>
+      <w:pPr>
+        <w:pBdr>
+          <w:top w:val="single" w:sz="4" w:space="8" w:color="D1D5DB"/>
+        </w:pBdr>
+        <w:spacing w:before="240" w:after="80"/>
+        <w:jc w:val="center"/>
+      </w:pPr>
+    </w:p>
+    <w:p>
+      <w:pPr>
+        <w:pBdr>
+          <w:top w:val="single" w:sz="4" w:space="8" w:color="D1D5DB"/>
+        </w:pBdr>
+        <w:spacing w:before="240" w:after="80"/>
+      </w:pPr>
+      <w:r>
+        <w:drawing>
+          <wp:inline distT="0" distB="0" distL="0" distR="0" wp14:anchorId="71C38561" wp14:editId="74E0C8E8">
+            <wp:extent cx="4701947" cy="2530059"/>
+            <wp:effectExtent l="0" t="0" r="3810" b="3810"/>
+            <wp:docPr id="1528427947" name="Picture 1"/>
+            <wp:cNvGraphicFramePr>
+              <a:graphicFrameLocks xmlns:a="http://schemas.openxmlformats.org/drawingml/2006/main" noChangeAspect="1"/>
+            </wp:cNvGraphicFramePr>
+            <a:graphic xmlns:a="http://schemas.openxmlformats.org/drawingml/2006/main">
+              <a:graphicData uri="http://schemas.openxmlformats.org/drawingml/2006/picture">
+                <pic:pic xmlns:pic="http://schemas.openxmlformats.org/drawingml/2006/picture">
+                  <pic:nvPicPr>
+                    <pic:cNvPr id="1528427947" name=""/>
+                    <pic:cNvPicPr/>
+                  </pic:nvPicPr>
+                  <pic:blipFill>
+                    <a:blip r:embed="rId7"/>
+                    <a:stretch>
+                      <a:fillRect/>
+                    </a:stretch>
+                  </pic:blipFill>
+                  <pic:spPr>
+                    <a:xfrm>
+                      <a:off x="0" y="0"/>
+                      <a:ext cx="4701947" cy="2530059"/>
+                    </a:xfrm>
+                    <a:prstGeom prst="rect">
+                      <a:avLst/>
+                    </a:prstGeom>
+                  </pic:spPr>
+                </pic:pic>
+              </a:graphicData>
+            </a:graphic>
+          </wp:inline>
+        </w:drawing>
+      </w:r>
+    </w:p>
+    <w:p>
+      <w:pPr>
+        <w:pBdr>
+          <w:top w:val="single" w:sz="4" w:space="8" w:color="D1D5DB"/>
+        </w:pBdr>
+        <w:spacing w:before="240" w:after="80"/>
+      </w:pPr>
+    </w:p>
+    <w:p>
+      <w:pPr>
+        <w:pBdr>
+          <w:top w:val="single" w:sz="4" w:space="8" w:color="D1D5DB"/>
+        </w:pBdr>
+        <w:spacing w:before="240" w:after="80"/>
+      </w:pPr>
+      <w:r>
+        <w:t>TOOLS:</w:t>
+      </w:r>
+    </w:p>
+    <w:p>
+      <w:pPr>
+        <w:pBdr>
+          <w:top w:val="single" w:sz="4" w:space="8" w:color="D1D5DB"/>
+        </w:pBdr>
+        <w:spacing w:before="240" w:after="80"/>
+      </w:pPr>
+      <w:r>
+        <w:lastRenderedPageBreak/>
+        <w:drawing>
+          <wp:inline distT="0" distB="0" distL="0" distR="0" wp14:anchorId="06B90069" wp14:editId="3CC58946">
+            <wp:extent cx="5943600" cy="2923540"/>
+            <wp:effectExtent l="0" t="0" r="0" b="0"/>
+            <wp:docPr id="2110625214" name="Picture 1"/>
+            <wp:cNvGraphicFramePr>
+              <a:graphicFrameLocks xmlns:a="http://schemas.openxmlformats.org/drawingml/2006/main" noChangeAspect="1"/>
+            </wp:cNvGraphicFramePr>
+            <a:graphic xmlns:a="http://schemas.openxmlformats.org/drawingml/2006/main">
+              <a:graphicData uri="http://schemas.openxmlformats.org/drawingml/2006/picture">
+                <pic:pic xmlns:pic="http://schemas.openxmlformats.org/drawingml/2006/picture">
+                  <pic:nvPicPr>
+                    <pic:cNvPr id="2110625214" name=""/>
+                    <pic:cNvPicPr/>
+                  </pic:nvPicPr>
+                  <pic:blipFill>
+                    <a:blip r:embed="rId8"/>
+                    <a:stretch>
+                      <a:fillRect/>
+                    </a:stretch>
+                  </pic:blipFill>
+                  <pic:spPr>
+                    <a:xfrm>
+                      <a:off x="0" y="0"/>
+                      <a:ext cx="5943600" cy="2923540"/>
+                    </a:xfrm>
+                    <a:prstGeom prst="rect">
+                      <a:avLst/>
+                    </a:prstGeom>
+                  </pic:spPr>
+                </pic:pic>
+              </a:graphicData>
+            </a:graphic>
+          </wp:inline>
+        </w:drawing>
+      </w:r>
+    </w:p>
+    <w:p>
+      <w:pPr>
+        <w:pBdr>
+          <w:top w:val="single" w:sz="4" w:space="8" w:color="D1D5DB"/>
+        </w:pBdr>
+        <w:spacing w:before="240" w:after="80"/>
+      </w:pPr>
+    </w:p>
+    <w:p>
+      <w:pPr>
+        <w:pBdr>
+          <w:top w:val="single" w:sz="4" w:space="8" w:color="D1D5DB"/>
+        </w:pBdr>
+        <w:spacing w:before="240" w:after="80"/>
+      </w:pPr>
+    </w:p>
+    <w:p>
+      <w:pPr>
+        <w:pBdr>
+          <w:top w:val="single" w:sz="4" w:space="8" w:color="D1D5DB"/>
+        </w:pBdr>
+        <w:spacing w:before="240" w:after="80"/>
+      </w:pPr>
+    </w:p>
+    <w:p>
+      <w:pPr>
+        <w:pBdr>
+          <w:top w:val="single" w:sz="4" w:space="8" w:color="D1D5DB"/>
+        </w:pBdr>
+        <w:spacing w:before="240" w:after="80"/>
+      </w:pPr>
+      <w:r>
+        <w:lastRenderedPageBreak/>
+        <w:drawing>
+          <wp:inline distT="0" distB="0" distL="0" distR="0" wp14:anchorId="62D1CB08" wp14:editId="2566EE70">
+            <wp:extent cx="5532599" cy="7026249"/>
+            <wp:effectExtent l="0" t="0" r="0" b="3810"/>
+            <wp:docPr id="56148230" name="Picture 1"/>
+            <wp:cNvGraphicFramePr>
+              <a:graphicFrameLocks xmlns:a="http://schemas.openxmlformats.org/drawingml/2006/main" noChangeAspect="1"/>
+            </wp:cNvGraphicFramePr>
+            <a:graphic xmlns:a="http://schemas.openxmlformats.org/drawingml/2006/main">
+              <a:graphicData uri="http://schemas.openxmlformats.org/drawingml/2006/picture">
+                <pic:pic xmlns:pic="http://schemas.openxmlformats.org/drawingml/2006/picture">
+                  <pic:nvPicPr>
+                    <pic:cNvPr id="56148230" name=""/>
+                    <pic:cNvPicPr/>
+                  </pic:nvPicPr>
+                  <pic:blipFill>
+                    <a:blip r:embed="rId9"/>
+                    <a:stretch>
+                      <a:fillRect/>
+                    </a:stretch>
+                  </pic:blipFill>
+                  <pic:spPr>
+                    <a:xfrm>
+                      <a:off x="0" y="0"/>
+                      <a:ext cx="5532599" cy="7026249"/>
+                    </a:xfrm>
+                    <a:prstGeom prst="rect">
+                      <a:avLst/>
+                    </a:prstGeom>
+                  </pic:spPr>
+                </pic:pic>
+              </a:graphicData>
+            </a:graphic>
+          </wp:inline>
+        </w:drawing>
+      </w:r>
+    </w:p>
+    <w:p>
+      <w:pPr>
+        <w:pBdr>
+          <w:top w:val="single" w:sz="4" w:space="8" w:color="D1D5DB"/>
+        </w:pBdr>
+        <w:spacing w:before="240" w:after="80"/>
+      </w:pPr>
+    </w:p>
+    <w:p>
+      <w:pPr>
+        <w:pBdr>
+          <w:top w:val="single" w:sz="4" w:space="8" w:color="D1D5DB"/>
+        </w:pBdr>
+        <w:spacing w:before="240" w:after="80"/>
+      </w:pPr>
+      <w:r>
+        <w:lastRenderedPageBreak/>
+        <w:drawing>
+          <wp:inline distT="0" distB="0" distL="0" distR="0" wp14:anchorId="7585DD24" wp14:editId="2B819721">
+            <wp:extent cx="2606266" cy="2606266"/>
+            <wp:effectExtent l="0" t="0" r="3810" b="3810"/>
+            <wp:docPr id="1559522840" name="Picture 1"/>
+            <wp:cNvGraphicFramePr>
+              <a:graphicFrameLocks xmlns:a="http://schemas.openxmlformats.org/drawingml/2006/main" noChangeAspect="1"/>
+            </wp:cNvGraphicFramePr>
+            <a:graphic xmlns:a="http://schemas.openxmlformats.org/drawingml/2006/main">
+              <a:graphicData uri="http://schemas.openxmlformats.org/drawingml/2006/picture">
+                <pic:pic xmlns:pic="http://schemas.openxmlformats.org/drawingml/2006/picture">
+                  <pic:nvPicPr>
+                    <pic:cNvPr id="1559522840" name=""/>
+                    <pic:cNvPicPr/>
+                  </pic:nvPicPr>
+                  <pic:blipFill>
+                    <a:blip r:embed="rId10"/>
+                    <a:stretch>
+                      <a:fillRect/>
+                    </a:stretch>
+                  </pic:blipFill>
+                  <pic:spPr>
+                    <a:xfrm>
+                      <a:off x="0" y="0"/>
+                      <a:ext cx="2606266" cy="2606266"/>
+                    </a:xfrm>
+                    <a:prstGeom prst="rect">
+                      <a:avLst/>
+                    </a:prstGeom>
+                  </pic:spPr>
+                </pic:pic>
+              </a:graphicData>
+            </a:graphic>
+          </wp:inline>
+        </w:drawing>
+      </w:r>
+    </w:p>
+    <w:p>
+      <w:pPr>
+        <w:pBdr>
+          <w:top w:val="single" w:sz="4" w:space="8" w:color="D1D5DB"/>
+        </w:pBdr>
+        <w:spacing w:before="240" w:after="80"/>
+      </w:pPr>
+    </w:p>
+    <w:p>
+      <w:pPr>
+        <w:pBdr>
+          <w:top w:val="single" w:sz="4" w:space="8" w:color="D1D5DB"/>
+        </w:pBdr>
+        <w:spacing w:before="240" w:after="80"/>
+      </w:pPr>
+      <w:r>
+        <w:t>Tools need contracts, permission, boundaries and logs</w:t>
+      </w:r>
+    </w:p>
+    <w:p>
+      <w:pPr>
+        <w:pBdr>
+          <w:top w:val="single" w:sz="4" w:space="8" w:color="D1D5DB"/>
+        </w:pBdr>
+        <w:spacing w:before="240" w:after="80"/>
+      </w:pPr>
+    </w:p>
+    <w:p>
+      <w:pPr>
+        <w:pBdr>
+          <w:top w:val="single" w:sz="4" w:space="8" w:color="D1D5DB"/>
+        </w:pBdr>
+        <w:spacing w:before="240" w:after="80"/>
+        <w:rPr>
+          <w:sz w:val="40"/>
+          <w:szCs w:val="40"/>
+        </w:rPr>
+      </w:pPr>
+      <w:r>
+        <w:rPr>
+          <w:sz w:val="40"/>
+          <w:szCs w:val="40"/>
+        </w:rPr>
+        <w:t>Memory and state:</w:t>
+      </w:r>
+    </w:p>
+    <w:p>
+      <w:pPr>
+        <w:pBdr>
+          <w:top w:val="single" w:sz="4" w:space="8" w:color="D1D5DB"/>
+        </w:pBdr>
+        <w:spacing w:before="240" w:after="80"/>
+      </w:pPr>
+      <w:r>
+        <w:t>State is current state conversation, but Memory long term conversation:</w:t>
+      </w:r>
+    </w:p>
+    <w:p>
+      <w:pPr>
+        <w:pBdr>
+          <w:top w:val="single" w:sz="4" w:space="8" w:color="D1D5DB"/>
+        </w:pBdr>
+        <w:spacing w:before="240" w:after="80"/>
+      </w:pPr>
+    </w:p>
+    <w:p>
+      <w:pPr>
+        <w:pBdr>
+          <w:top w:val="single" w:sz="4" w:space="8" w:color="D1D5DB"/>
+        </w:pBdr>
+        <w:spacing w:before="240" w:after="80"/>
+      </w:pPr>
+      <w:r>
+        <w:drawing>
+          <wp:inline distT="0" distB="0" distL="0" distR="0" wp14:anchorId="3D286EFD" wp14:editId="5336BBD9">
+            <wp:extent cx="4054191" cy="2834886"/>
+            <wp:effectExtent l="0" t="0" r="3810" b="3810"/>
+            <wp:docPr id="1052776372" name="Picture 1"/>
+            <wp:cNvGraphicFramePr>
+              <a:graphicFrameLocks xmlns:a="http://schemas.openxmlformats.org/drawingml/2006/main" noChangeAspect="1"/>
+            </wp:cNvGraphicFramePr>
+            <a:graphic xmlns:a="http://schemas.openxmlformats.org/drawingml/2006/main">
+              <a:graphicData uri="http://schemas.openxmlformats.org/drawingml/2006/picture">
+                <pic:pic xmlns:pic="http://schemas.openxmlformats.org/drawingml/2006/picture">
+                  <pic:nvPicPr>
+                    <pic:cNvPr id="1052776372" name=""/>
+                    <pic:cNvPicPr/>
+                  </pic:nvPicPr>
+                  <pic:blipFill>
+                    <a:blip r:embed="rId11"/>
+                    <a:stretch>
+                      <a:fillRect/>
+                    </a:stretch>
+                  </pic:blipFill>
+                  <pic:spPr>
+                    <a:xfrm>
+                      <a:off x="0" y="0"/>
+                      <a:ext cx="4054191" cy="2834886"/>
+                    </a:xfrm>
+                    <a:prstGeom prst="rect">
+                      <a:avLst/>
+                    </a:prstGeom>
+                  </pic:spPr>
+                </pic:pic>
+              </a:graphicData>
+            </a:graphic>
+          </wp:inline>
+        </w:drawing>
+      </w:r>
+    </w:p>
+    <w:p>
+      <w:pPr>
+        <w:pBdr>
+          <w:top w:val="single" w:sz="4" w:space="8" w:color="D1D5DB"/>
+        </w:pBdr>
+        <w:spacing w:before="240" w:after="80"/>
+      </w:pPr>
+      <w:r>
+        <w:lastRenderedPageBreak/>
+        <w:drawing>
+          <wp:inline distT="0" distB="0" distL="0" distR="0" wp14:anchorId="1E0EEECD" wp14:editId="3DEBFE6C">
+            <wp:extent cx="5768840" cy="1714649"/>
+            <wp:effectExtent l="0" t="0" r="3810" b="0"/>
+            <wp:docPr id="511565305" name="Picture 1"/>
+            <wp:cNvGraphicFramePr>
+              <a:graphicFrameLocks xmlns:a="http://schemas.openxmlformats.org/drawingml/2006/main" noChangeAspect="1"/>
+            </wp:cNvGraphicFramePr>
+            <a:graphic xmlns:a="http://schemas.openxmlformats.org/drawingml/2006/main">
+              <a:graphicData uri="http://schemas.openxmlformats.org/drawingml/2006/picture">
+                <pic:pic xmlns:pic="http://schemas.openxmlformats.org/drawingml/2006/picture">
+                  <pic:nvPicPr>
+                    <pic:cNvPr id="511565305" name=""/>
+                    <pic:cNvPicPr/>
+                  </pic:nvPicPr>
+                  <pic:blipFill>
+                    <a:blip r:embed="rId12"/>
+                    <a:stretch>
+                      <a:fillRect/>
+                    </a:stretch>
+                  </pic:blipFill>
+                  <pic:spPr>
+                    <a:xfrm>
+                      <a:off x="0" y="0"/>
+                      <a:ext cx="5768840" cy="1714649"/>
+                    </a:xfrm>
+                    <a:prstGeom prst="rect">
+                      <a:avLst/>
+                    </a:prstGeom>
+                  </pic:spPr>
+                </pic:pic>
+              </a:graphicData>
+            </a:graphic>
+          </wp:inline>
+        </w:drawing>
+      </w:r>
+    </w:p>
+    <w:p>
+      <w:pPr>
+        <w:pBdr>
+          <w:top w:val="single" w:sz="4" w:space="8" w:color="D1D5DB"/>
+        </w:pBdr>
+        <w:spacing w:before="240" w:after="80"/>
+      </w:pPr>
+      <w:r>
+        <w:t>Application state should be stored in Application database not vector database:</w:t>
+      </w:r>
+    </w:p>
+    <w:p>
+      <w:pPr>
+        <w:pBdr>
+          <w:top w:val="single" w:sz="4" w:space="8" w:color="D1D5DB"/>
+        </w:pBdr>
+        <w:spacing w:before="240" w:after="80"/>
+      </w:pPr>
+    </w:p>
+    <w:p>
+      <w:pPr>
+        <w:pBdr>
+          <w:top w:val="single" w:sz="4" w:space="8" w:color="D1D5DB"/>
+        </w:pBdr>
+        <w:spacing w:before="240" w:after="80"/>
+      </w:pPr>
+      <w:r>
+        <w:t>Knowledge database like RAG</w:t>
+      </w:r>
+    </w:p>
+    <w:p>
+      <w:pPr>
+        <w:pBdr>
+          <w:top w:val="single" w:sz="4" w:space="8" w:color="D1D5DB"/>
+        </w:pBdr>
+        <w:spacing w:before="240" w:after="80"/>
+      </w:pPr>
+      <w:r>
+        <w:drawing>
+          <wp:inline distT="0" distB="0" distL="0" distR="0" wp14:anchorId="1CF35AB2" wp14:editId="593DE39E">
+            <wp:extent cx="5943600" cy="1652270"/>
+            <wp:effectExtent l="0" t="0" r="0" b="5080"/>
+            <wp:docPr id="1491113158" name="Picture 1"/>
+            <wp:cNvGraphicFramePr>
+              <a:graphicFrameLocks xmlns:a="http://schemas.openxmlformats.org/drawingml/2006/main" noChangeAspect="1"/>
+            </wp:cNvGraphicFramePr>
+            <a:graphic xmlns:a="http://schemas.openxmlformats.org/drawingml/2006/main">
+              <a:graphicData uri="http://schemas.openxmlformats.org/drawingml/2006/picture">
+                <pic:pic xmlns:pic="http://schemas.openxmlformats.org/drawingml/2006/picture">
+                  <pic:nvPicPr>
+                    <pic:cNvPr id="1491113158" name=""/>
+                    <pic:cNvPicPr/>
+                  </pic:nvPicPr>
+                  <pic:blipFill>
+                    <a:blip r:embed="rId13"/>
+                    <a:stretch>
+                      <a:fillRect/>
+                    </a:stretch>
+                  </pic:blipFill>
+                  <pic:spPr>
+                    <a:xfrm>
+                      <a:off x="0" y="0"/>
+                      <a:ext cx="5943600" cy="1652270"/>
+                    </a:xfrm>
+                    <a:prstGeom prst="rect">
+                      <a:avLst/>
+                    </a:prstGeom>
+                  </pic:spPr>
+                </pic:pic>
+              </a:graphicData>
+            </a:graphic>
+          </wp:inline>
+        </w:drawing>
+      </w:r>
+    </w:p>
+    <w:p>
+      <w:pPr>
+        <w:pBdr>
+          <w:top w:val="single" w:sz="4" w:space="8" w:color="D1D5DB"/>
+        </w:pBdr>
+        <w:spacing w:before="240" w:after="80"/>
+      </w:pPr>
+    </w:p>
+    <w:p>
+      <w:pPr>
+        <w:pBdr>
+          <w:top w:val="single" w:sz="4" w:space="8" w:color="D1D5DB"/>
+        </w:pBdr>
+        <w:spacing w:before="240" w:after="80"/>
+      </w:pPr>
+      <w:r>
+        <w:t>Keep in mind:</w:t>
+      </w:r>
+    </w:p>
+    <w:p>
+      <w:pPr>
+        <w:pBdr>
+          <w:top w:val="single" w:sz="4" w:space="8" w:color="D1D5DB"/>
+        </w:pBdr>
+        <w:spacing w:before="240" w:after="80"/>
+      </w:pPr>
+      <w:r>
+        <w:t>Short Term memory: what you want to get the current prompt</w:t>
+      </w:r>
+    </w:p>
+    <w:p>
+      <w:pPr>
+        <w:pBdr>
+          <w:top w:val="single" w:sz="4" w:space="8" w:color="D1D5DB"/>
+        </w:pBdr>
+        <w:spacing w:before="240" w:after="80"/>
+      </w:pPr>
+      <w:r>
+        <w:t>Long Term memory: what you want retrieve selectively from the past</w:t>
+      </w:r>
+    </w:p>
+    <w:p>
+      <w:pPr>
+        <w:pBdr>
+          <w:top w:val="single" w:sz="4" w:space="8" w:color="D1D5DB"/>
+        </w:pBdr>
+        <w:spacing w:before="240" w:after="80"/>
+      </w:pPr>
+      <w:r>
+        <w:drawing>
+          <wp:inline distT="0" distB="0" distL="0" distR="0" wp14:anchorId="2AC3BCAD" wp14:editId="322A0979">
+            <wp:extent cx="4922947" cy="952583"/>
+            <wp:effectExtent l="0" t="0" r="0" b="0"/>
+            <wp:docPr id="1555207041" name="Picture 1"/>
+            <wp:cNvGraphicFramePr>
+              <a:graphicFrameLocks xmlns:a="http://schemas.openxmlformats.org/drawingml/2006/main" noChangeAspect="1"/>
+            </wp:cNvGraphicFramePr>
+            <a:graphic xmlns:a="http://schemas.openxmlformats.org/drawingml/2006/main">
+              <a:graphicData uri="http://schemas.openxmlformats.org/drawingml/2006/picture">
+                <pic:pic xmlns:pic="http://schemas.openxmlformats.org/drawingml/2006/picture">
+                  <pic:nvPicPr>
+                    <pic:cNvPr id="1555207041" name=""/>
+                    <pic:cNvPicPr/>
+                  </pic:nvPicPr>
+                  <pic:blipFill>
+                    <a:blip r:embed="rId14"/>
+                    <a:stretch>
+                      <a:fillRect/>
+                    </a:stretch>
+                  </pic:blipFill>
+                  <pic:spPr>
+                    <a:xfrm>
+                      <a:off x="0" y="0"/>
+                      <a:ext cx="4922947" cy="952583"/>
+                    </a:xfrm>
+                    <a:prstGeom prst="rect">
+                      <a:avLst/>
+                    </a:prstGeom>
+                  </pic:spPr>
+                </pic:pic>
+              </a:graphicData>
+            </a:graphic>
+          </wp:inline>
+        </w:drawing>
+      </w:r>
+    </w:p>
+    <w:p>
+      <w:pPr>
+        <w:pBdr>
+          <w:top w:val="single" w:sz="4" w:space="8" w:color="D1D5DB"/>
+        </w:pBdr>
+        <w:spacing w:before="240" w:after="80"/>
+      </w:pPr>
+    </w:p>
+    <w:p>
+      <w:pPr>
+        <w:pBdr>
+          <w:top w:val="single" w:sz="4" w:space="8" w:color="D1D5DB"/>
+        </w:pBdr>
+        <w:spacing w:before="240" w:after="80"/>
+        <w:rPr>
+          <w:sz w:val="40"/>
+          <w:szCs w:val="40"/>
+        </w:rPr>
+      </w:pPr>
+      <w:r>
+        <w:rPr>
+          <w:sz w:val="40"/>
+          <w:szCs w:val="40"/>
+        </w:rPr>
+        <w:t>Orchestration</w:t>
+      </w:r>
+      <w:r>
+        <w:rPr>
+          <w:sz w:val="40"/>
+          <w:szCs w:val="40"/>
+        </w:rPr>
+        <w:t>:</w:t>
+      </w:r>
+    </w:p>
+    <w:p>
+      <w:pPr>
+        <w:pBdr>
+          <w:top w:val="single" w:sz="4" w:space="8" w:color="D1D5DB"/>
+        </w:pBdr>
+        <w:spacing w:before="240" w:after="80"/>
+      </w:pPr>
+    </w:p>
+    <w:p>
+      <w:pPr>
+        <w:pBdr>
+          <w:top w:val="single" w:sz="4" w:space="8" w:color="D1D5DB"/>
+        </w:pBdr>
+        <w:spacing w:before="240" w:after="80"/>
+      </w:pPr>
+      <w:r>
+        <w:lastRenderedPageBreak/>
+        <w:drawing>
+          <wp:inline distT="0" distB="0" distL="0" distR="0" wp14:anchorId="1E9B20F1" wp14:editId="7430D5D1">
+            <wp:extent cx="5943600" cy="1384935"/>
+            <wp:effectExtent l="0" t="0" r="0" b="5715"/>
+            <wp:docPr id="1424597978" name="Picture 1"/>
+            <wp:cNvGraphicFramePr>
+              <a:graphicFrameLocks xmlns:a="http://schemas.openxmlformats.org/drawingml/2006/main" noChangeAspect="1"/>
+            </wp:cNvGraphicFramePr>
+            <a:graphic xmlns:a="http://schemas.openxmlformats.org/drawingml/2006/main">
+              <a:graphicData uri="http://schemas.openxmlformats.org/drawingml/2006/picture">
+                <pic:pic xmlns:pic="http://schemas.openxmlformats.org/drawingml/2006/picture">
+                  <pic:nvPicPr>
+                    <pic:cNvPr id="1424597978" name=""/>
+                    <pic:cNvPicPr/>
+                  </pic:nvPicPr>
+                  <pic:blipFill>
+                    <a:blip r:embed="rId15"/>
+                    <a:stretch>
+                      <a:fillRect/>
+                    </a:stretch>
+                  </pic:blipFill>
+                  <pic:spPr>
+                    <a:xfrm>
+                      <a:off x="0" y="0"/>
+                      <a:ext cx="5943600" cy="1384935"/>
+                    </a:xfrm>
+                    <a:prstGeom prst="rect">
+                      <a:avLst/>
+                    </a:prstGeom>
+                  </pic:spPr>
+                </pic:pic>
+              </a:graphicData>
+            </a:graphic>
+          </wp:inline>
+        </w:drawing>
+      </w:r>
+    </w:p>
+    <w:p>
+      <w:pPr>
+        <w:pBdr>
+          <w:top w:val="single" w:sz="4" w:space="8" w:color="D1D5DB"/>
+        </w:pBdr>
+        <w:spacing w:before="240" w:after="80"/>
+      </w:pPr>
+    </w:p>
+    <w:p>
+      <w:pPr>
+        <w:pBdr>
+          <w:top w:val="single" w:sz="4" w:space="8" w:color="D1D5DB"/>
+        </w:pBdr>
+        <w:spacing w:before="240" w:after="80"/>
+      </w:pPr>
+      <w:r>
+        <w:t>Example:</w:t>
+      </w:r>
+    </w:p>
+    <w:p>
+      <w:pPr>
+        <w:pBdr>
+          <w:top w:val="single" w:sz="4" w:space="8" w:color="D1D5DB"/>
+        </w:pBdr>
+        <w:spacing w:before="240" w:after="80"/>
+      </w:pPr>
+      <w:r>
+        <w:drawing>
+          <wp:inline distT="0" distB="0" distL="0" distR="0" wp14:anchorId="0170358D" wp14:editId="30881724">
+            <wp:extent cx="5943600" cy="3745865"/>
+            <wp:effectExtent l="0" t="0" r="0" b="6985"/>
+            <wp:docPr id="1315470021" name="Picture 1"/>
+            <wp:cNvGraphicFramePr>
+              <a:graphicFrameLocks xmlns:a="http://schemas.openxmlformats.org/drawingml/2006/main" noChangeAspect="1"/>
+            </wp:cNvGraphicFramePr>
+            <a:graphic xmlns:a="http://schemas.openxmlformats.org/drawingml/2006/main">
+              <a:graphicData uri="http://schemas.openxmlformats.org/drawingml/2006/picture">
+                <pic:pic xmlns:pic="http://schemas.openxmlformats.org/drawingml/2006/picture">
+                  <pic:nvPicPr>
+                    <pic:cNvPr id="1315470021" name=""/>
+                    <pic:cNvPicPr/>
+                  </pic:nvPicPr>
+                  <pic:blipFill>
+                    <a:blip r:embed="rId16"/>
+                    <a:stretch>
+                      <a:fillRect/>
+                    </a:stretch>
+                  </pic:blipFill>
+                  <pic:spPr>
+                    <a:xfrm>
+                      <a:off x="0" y="0"/>
+                      <a:ext cx="5943600" cy="3745865"/>
+                    </a:xfrm>
+                    <a:prstGeom prst="rect">
+                      <a:avLst/>
+                    </a:prstGeom>
+                  </pic:spPr>
+                </pic:pic>
+              </a:graphicData>
+            </a:graphic>
+          </wp:inline>
+        </w:drawing>
+      </w:r>
+    </w:p>
+    <w:p>
+      <w:pPr>
+        <w:pBdr>
+          <w:top w:val="single" w:sz="4" w:space="8" w:color="D1D5DB"/>
+        </w:pBdr>
+        <w:spacing w:before="240" w:after="80"/>
+      </w:pPr>
+    </w:p>
+    <w:p>
+      <w:pPr>
+        <w:pBdr>
+          <w:top w:val="single" w:sz="4" w:space="8" w:color="D1D5DB"/>
+        </w:pBdr>
+        <w:spacing w:before="240" w:after="80"/>
+        <w:rPr>
+          <w:sz w:val="28"/>
+          <w:szCs w:val="28"/>
+        </w:rPr>
+      </w:pPr>
+      <w:r>
+        <w:rPr>
+          <w:sz w:val="28"/>
+          <w:szCs w:val="28"/>
+        </w:rPr>
+        <w:t>***** Do not confuse autonomy with lack of structure</w:t>
+      </w:r>
+    </w:p>
+    <w:p>
+      <w:pPr>
+        <w:pBdr>
+          <w:top w:val="single" w:sz="4" w:space="8" w:color="D1D5DB"/>
+        </w:pBdr>
+        <w:spacing w:before="240" w:after="80"/>
+        <w:rPr>
+          <w:sz w:val="28"/>
+          <w:szCs w:val="28"/>
+        </w:rPr>
+      </w:pPr>
+    </w:p>
+    <w:p>
+      <w:pPr>
+        <w:pBdr>
+          <w:top w:val="single" w:sz="4" w:space="8" w:color="D1D5DB"/>
+        </w:pBdr>
+        <w:spacing w:before="240" w:after="80"/>
+        <w:rPr>
+          <w:sz w:val="28"/>
+          <w:szCs w:val="28"/>
+        </w:rPr>
+      </w:pPr>
+    </w:p>
+    <w:p>
+      <w:pPr>
+        <w:pBdr>
+          <w:top w:val="single" w:sz="4" w:space="8" w:color="D1D5DB"/>
+        </w:pBdr>
+        <w:spacing w:before="240" w:after="80"/>
+        <w:rPr>
+          <w:sz w:val="28"/>
+          <w:szCs w:val="28"/>
+        </w:rPr>
+      </w:pPr>
+    </w:p>
+    <w:p>
+      <w:pPr>
+        <w:pBdr>
+          <w:top w:val="single" w:sz="4" w:space="8" w:color="D1D5DB"/>
+        </w:pBdr>
+        <w:spacing w:before="240" w:after="80"/>
+        <w:rPr>
+          <w:sz w:val="28"/>
+          <w:szCs w:val="28"/>
+        </w:rPr>
+      </w:pPr>
+    </w:p>
+    <w:p>
+      <w:pPr>
+        <w:pBdr>
+          <w:top w:val="single" w:sz="4" w:space="8" w:color="D1D5DB"/>
+        </w:pBdr>
+        <w:spacing w:before="240" w:after="80"/>
+        <w:rPr>
+          <w:sz w:val="40"/>
+          <w:szCs w:val="40"/>
+        </w:rPr>
+      </w:pPr>
+      <w:r>
+        <w:rPr>
+          <w:sz w:val="40"/>
+          <w:szCs w:val="40"/>
+        </w:rPr>
+        <w:lastRenderedPageBreak/>
+        <w:t>Evaluation</w:t>
+      </w:r>
+      <w:r>
+        <w:rPr>
+          <w:sz w:val="40"/>
+          <w:szCs w:val="40"/>
+        </w:rPr>
+        <w:t>:</w:t>
+      </w:r>
+    </w:p>
+    <w:p>
+      <w:pPr>
+        <w:pBdr>
+          <w:top w:val="single" w:sz="4" w:space="8" w:color="D1D5DB"/>
+        </w:pBdr>
+        <w:spacing w:before="240" w:after="80"/>
+        <w:rPr>
+          <w:sz w:val="40"/>
+          <w:szCs w:val="40"/>
+        </w:rPr>
+      </w:pPr>
+      <w:r>
+        <w:rPr>
+          <w:sz w:val="40"/>
+          <w:szCs w:val="40"/>
+        </w:rPr>
+        <w:drawing>
+          <wp:inline distT="0" distB="0" distL="0" distR="0" wp14:anchorId="08062343" wp14:editId="3FEC56D9">
+            <wp:extent cx="5943600" cy="4041140"/>
+            <wp:effectExtent l="0" t="0" r="0" b="0"/>
+            <wp:docPr id="1488906993" name="Picture 1"/>
+            <wp:cNvGraphicFramePr>
+              <a:graphicFrameLocks xmlns:a="http://schemas.openxmlformats.org/drawingml/2006/main" noChangeAspect="1"/>
+            </wp:cNvGraphicFramePr>
+            <a:graphic xmlns:a="http://schemas.openxmlformats.org/drawingml/2006/main">
+              <a:graphicData uri="http://schemas.openxmlformats.org/drawingml/2006/picture">
+                <pic:pic xmlns:pic="http://schemas.openxmlformats.org/drawingml/2006/picture">
+                  <pic:nvPicPr>
+                    <pic:cNvPr id="1488906993" name=""/>
+                    <pic:cNvPicPr/>
+                  </pic:nvPicPr>
+                  <pic:blipFill>
+                    <a:blip r:embed="rId17"/>
+                    <a:stretch>
+                      <a:fillRect/>
+                    </a:stretch>
+                  </pic:blipFill>
+                  <pic:spPr>
+                    <a:xfrm>
+                      <a:off x="0" y="0"/>
+                      <a:ext cx="5943600" cy="4041140"/>
+                    </a:xfrm>
+                    <a:prstGeom prst="rect">
+                      <a:avLst/>
+                    </a:prstGeom>
+                  </pic:spPr>
+                </pic:pic>
+              </a:graphicData>
+            </a:graphic>
+          </wp:inline>
+        </w:drawing>
+      </w:r>
+    </w:p>
+    <w:p>
+      <w:pPr>
+        <w:pBdr>
+          <w:top w:val="single" w:sz="4" w:space="8" w:color="D1D5DB"/>
+        </w:pBdr>
+        <w:spacing w:before="240" w:after="80"/>
+        <w:rPr>
+          <w:sz w:val="40"/>
+          <w:szCs w:val="40"/>
+        </w:rPr>
+      </w:pPr>
+    </w:p>
+    <w:p>
+      <w:pPr>
+        <w:pBdr>
+          <w:top w:val="single" w:sz="4" w:space="8" w:color="D1D5DB"/>
+        </w:pBdr>
+        <w:spacing w:before="240" w:after="80"/>
+        <w:rPr>
+          <w:sz w:val="40"/>
+          <w:szCs w:val="40"/>
+        </w:rPr>
+      </w:pPr>
+      <w:r>
+        <w:rPr>
+          <w:sz w:val="40"/>
+          <w:szCs w:val="40"/>
+        </w:rPr>
+        <w:t>You need trace level validation always</w:t>
+      </w:r>
+    </w:p>
+    <w:p>
+      <w:pPr>
+        <w:pBdr>
+          <w:top w:val="single" w:sz="4" w:space="8" w:color="D1D5DB"/>
+        </w:pBdr>
+        <w:spacing w:before="240" w:after="80"/>
+        <w:rPr>
+          <w:sz w:val="40"/>
+          <w:szCs w:val="40"/>
+        </w:rPr>
+      </w:pPr>
+      <w:r>
+        <w:rPr>
+          <w:sz w:val="40"/>
+          <w:szCs w:val="40"/>
+        </w:rPr>
+        <w:lastRenderedPageBreak/>
+        <w:drawing>
+          <wp:inline distT="0" distB="0" distL="0" distR="0" wp14:anchorId="44888B17" wp14:editId="4BD4F64A">
+            <wp:extent cx="5943600" cy="3866515"/>
+            <wp:effectExtent l="0" t="0" r="0" b="635"/>
+            <wp:docPr id="844634116" name="Picture 1"/>
+            <wp:cNvGraphicFramePr>
+              <a:graphicFrameLocks xmlns:a="http://schemas.openxmlformats.org/drawingml/2006/main" noChangeAspect="1"/>
+            </wp:cNvGraphicFramePr>
+            <a:graphic xmlns:a="http://schemas.openxmlformats.org/drawingml/2006/main">
+              <a:graphicData uri="http://schemas.openxmlformats.org/drawingml/2006/picture">
+                <pic:pic xmlns:pic="http://schemas.openxmlformats.org/drawingml/2006/picture">
+                  <pic:nvPicPr>
+                    <pic:cNvPr id="844634116" name=""/>
+                    <pic:cNvPicPr/>
+                  </pic:nvPicPr>
+                  <pic:blipFill>
+                    <a:blip r:embed="rId18"/>
+                    <a:stretch>
+                      <a:fillRect/>
+                    </a:stretch>
+                  </pic:blipFill>
+                  <pic:spPr>
+                    <a:xfrm>
+                      <a:off x="0" y="0"/>
+                      <a:ext cx="5943600" cy="3866515"/>
+                    </a:xfrm>
+                    <a:prstGeom prst="rect">
+                      <a:avLst/>
+                    </a:prstGeom>
+                  </pic:spPr>
+                </pic:pic>
+              </a:graphicData>
+            </a:graphic>
+          </wp:inline>
+        </w:drawing>
+      </w:r>
+    </w:p>
+    <w:p>
+      <w:pPr>
+        <w:pBdr>
+          <w:top w:val="single" w:sz="4" w:space="8" w:color="D1D5DB"/>
+        </w:pBdr>
+        <w:spacing w:before="240" w:after="80"/>
+        <w:rPr>
+          <w:sz w:val="40"/>
+          <w:szCs w:val="40"/>
+        </w:rPr>
+      </w:pPr>
+    </w:p>
+    <w:p>
+      <w:pPr>
+        <w:pBdr>
+          <w:top w:val="single" w:sz="4" w:space="8" w:color="D1D5DB"/>
+        </w:pBdr>
+        <w:spacing w:before="240" w:after="80"/>
+        <w:rPr>
+          <w:sz w:val="40"/>
+          <w:szCs w:val="40"/>
+        </w:rPr>
+      </w:pPr>
+      <w:r>
+        <w:rPr>
+          <w:sz w:val="40"/>
+          <w:szCs w:val="40"/>
+        </w:rPr>
+        <w:drawing>
+          <wp:inline distT="0" distB="0" distL="0" distR="0" wp14:anchorId="23E6A7E8" wp14:editId="4358FEE1">
+            <wp:extent cx="5943600" cy="1183640"/>
+            <wp:effectExtent l="0" t="0" r="0" b="0"/>
+            <wp:docPr id="2060846535" name="Picture 1"/>
+            <wp:cNvGraphicFramePr>
+              <a:graphicFrameLocks xmlns:a="http://schemas.openxmlformats.org/drawingml/2006/main" noChangeAspect="1"/>
+            </wp:cNvGraphicFramePr>
+            <a:graphic xmlns:a="http://schemas.openxmlformats.org/drawingml/2006/main">
+              <a:graphicData uri="http://schemas.openxmlformats.org/drawingml/2006/picture">
+                <pic:pic xmlns:pic="http://schemas.openxmlformats.org/drawingml/2006/picture">
+                  <pic:nvPicPr>
+                    <pic:cNvPr id="2060846535" name=""/>
+                    <pic:cNvPicPr/>
+                  </pic:nvPicPr>
+                  <pic:blipFill>
+                    <a:blip r:embed="rId19"/>
+                    <a:stretch>
+                      <a:fillRect/>
+                    </a:stretch>
+                  </pic:blipFill>
+                  <pic:spPr>
+                    <a:xfrm>
+                      <a:off x="0" y="0"/>
+                      <a:ext cx="5943600" cy="1183640"/>
+                    </a:xfrm>
+                    <a:prstGeom prst="rect">
+                      <a:avLst/>
+                    </a:prstGeom>
+                  </pic:spPr>
+                </pic:pic>
+              </a:graphicData>
+            </a:graphic>
+          </wp:inline>
+        </w:drawing>
+      </w:r>
+    </w:p>
+    <w:p>
+      <w:pPr>
+        <w:pBdr>
+          <w:top w:val="single" w:sz="4" w:space="8" w:color="D1D5DB"/>
+        </w:pBdr>
+        <w:spacing w:before="240" w:after="80"/>
+        <w:rPr>
+          <w:sz w:val="40"/>
+          <w:szCs w:val="40"/>
+        </w:rPr>
+      </w:pPr>
+      <w:r>
+        <w:rPr>
+          <w:sz w:val="40"/>
+          <w:szCs w:val="40"/>
+        </w:rPr>
+        <w:drawing>
+          <wp:inline distT="0" distB="0" distL="0" distR="0" wp14:anchorId="3061819C" wp14:editId="0E1C6EBB">
+            <wp:extent cx="5943600" cy="629920"/>
+            <wp:effectExtent l="0" t="0" r="0" b="0"/>
+            <wp:docPr id="2059544405" name="Picture 1"/>
+            <wp:cNvGraphicFramePr>
+              <a:graphicFrameLocks xmlns:a="http://schemas.openxmlformats.org/drawingml/2006/main" noChangeAspect="1"/>
+            </wp:cNvGraphicFramePr>
+            <a:graphic xmlns:a="http://schemas.openxmlformats.org/drawingml/2006/main">
+              <a:graphicData uri="http://schemas.openxmlformats.org/drawingml/2006/picture">
+                <pic:pic xmlns:pic="http://schemas.openxmlformats.org/drawingml/2006/picture">
+                  <pic:nvPicPr>
+                    <pic:cNvPr id="2059544405" name=""/>
+                    <pic:cNvPicPr/>
+                  </pic:nvPicPr>
+                  <pic:blipFill>
+                    <a:blip r:embed="rId20"/>
+                    <a:stretch>
+                      <a:fillRect/>
+                    </a:stretch>
+                  </pic:blipFill>
+                  <pic:spPr>
+                    <a:xfrm>
+                      <a:off x="0" y="0"/>
+                      <a:ext cx="5943600" cy="629920"/>
+                    </a:xfrm>
+                    <a:prstGeom prst="rect">
+                      <a:avLst/>
+                    </a:prstGeom>
+                  </pic:spPr>
+                </pic:pic>
+              </a:graphicData>
+            </a:graphic>
+          </wp:inline>
+        </w:drawing>
+      </w:r>
+    </w:p>
+    <w:p>
+      <w:pPr>
+        <w:pBdr>
+          <w:top w:val="single" w:sz="4" w:space="8" w:color="D1D5DB"/>
+        </w:pBdr>
+        <w:spacing w:before="240" w:after="80"/>
+        <w:rPr>
+          <w:sz w:val="40"/>
+          <w:szCs w:val="40"/>
+        </w:rPr>
+      </w:pPr>
+      <w:r>
+        <w:rPr>
+          <w:sz w:val="40"/>
+          <w:szCs w:val="40"/>
+        </w:rPr>
+        <w:t>Metrics to check below when you are implementing in production environment:</w:t>
+      </w:r>
+    </w:p>
+    <w:p>
+      <w:pPr>
+        <w:pBdr>
+          <w:top w:val="single" w:sz="4" w:space="8" w:color="D1D5DB"/>
+        </w:pBdr>
+        <w:spacing w:before="240" w:after="80"/>
+        <w:rPr>
+          <w:sz w:val="40"/>
+          <w:szCs w:val="40"/>
+        </w:rPr>
+      </w:pPr>
+      <w:r>
+        <w:rPr>
+          <w:sz w:val="40"/>
+          <w:szCs w:val="40"/>
+        </w:rPr>
+        <w:lastRenderedPageBreak/>
+        <w:drawing>
+          <wp:inline distT="0" distB="0" distL="0" distR="0" wp14:anchorId="655B2BEF" wp14:editId="75B15CD8">
+            <wp:extent cx="3444538" cy="3101609"/>
+            <wp:effectExtent l="0" t="0" r="3810" b="3810"/>
+            <wp:docPr id="1500727051" name="Picture 1"/>
+            <wp:cNvGraphicFramePr>
+              <a:graphicFrameLocks xmlns:a="http://schemas.openxmlformats.org/drawingml/2006/main" noChangeAspect="1"/>
+            </wp:cNvGraphicFramePr>
+            <a:graphic xmlns:a="http://schemas.openxmlformats.org/drawingml/2006/main">
+              <a:graphicData uri="http://schemas.openxmlformats.org/drawingml/2006/picture">
+                <pic:pic xmlns:pic="http://schemas.openxmlformats.org/drawingml/2006/picture">
+                  <pic:nvPicPr>
+                    <pic:cNvPr id="1500727051" name=""/>
+                    <pic:cNvPicPr/>
+                  </pic:nvPicPr>
+                  <pic:blipFill>
+                    <a:blip r:embed="rId21"/>
+                    <a:stretch>
+                      <a:fillRect/>
+                    </a:stretch>
+                  </pic:blipFill>
+                  <pic:spPr>
+                    <a:xfrm>
+                      <a:off x="0" y="0"/>
+                      <a:ext cx="3444538" cy="3101609"/>
+                    </a:xfrm>
+                    <a:prstGeom prst="rect">
+                      <a:avLst/>
+                    </a:prstGeom>
+                  </pic:spPr>
+                </pic:pic>
+              </a:graphicData>
+            </a:graphic>
+          </wp:inline>
+        </w:drawing>
+      </w:r>
+    </w:p>
+    <w:p>
+      <w:pPr>
+        <w:pBdr>
+          <w:top w:val="single" w:sz="4" w:space="8" w:color="D1D5DB"/>
+        </w:pBdr>
+        <w:spacing w:before="240" w:after="80"/>
+        <w:rPr>
+          <w:sz w:val="28"/>
+          <w:szCs w:val="28"/>
+        </w:rPr>
+      </w:pPr>
+    </w:p>
+    <w:p>
+      <w:pPr>
+        <w:pBdr>
+          <w:top w:val="single" w:sz="4" w:space="8" w:color="D1D5DB"/>
+        </w:pBdr>
+        <w:spacing w:before="240" w:after="80"/>
+      </w:pPr>
+    </w:p>
+    <w:p>
+      <w:pPr>
+        <w:pBdr>
+          <w:top w:val="single" w:sz="4" w:space="8" w:color="D1D5DB"/>
+        </w:pBdr>
+        <w:spacing w:before="240" w:after="80"/>
+      </w:pPr>
+    </w:p>
+    <w:p>
+      <w:pPr>
+        <w:pBdr>
+          <w:top w:val="single" w:sz="4" w:space="8" w:color="D1D5DB"/>
+        </w:pBdr>
+        <w:spacing w:before="240" w:after="80"/>
+        <w:rPr>
+          <w:sz w:val="40"/>
+          <w:szCs w:val="40"/>
+        </w:rPr>
+      </w:pPr>
+      <w:r>
+        <w:rPr>
+          <w:sz w:val="40"/>
+          <w:szCs w:val="40"/>
+        </w:rPr>
+        <w:t>Approval and Policy Control</w:t>
+      </w:r>
+      <w:r>
+        <w:rPr>
+          <w:sz w:val="40"/>
+          <w:szCs w:val="40"/>
+        </w:rPr>
+        <w:t>:</w:t>
+      </w:r>
+    </w:p>
+    <w:p>
+      <w:pPr>
+        <w:pBdr>
+          <w:top w:val="single" w:sz="4" w:space="8" w:color="D1D5DB"/>
+        </w:pBdr>
+        <w:spacing w:before="240" w:after="80"/>
+        <w:rPr>
+          <w:sz w:val="40"/>
+          <w:szCs w:val="40"/>
+        </w:rPr>
+      </w:pPr>
+      <w:r>
+        <w:rPr>
+          <w:sz w:val="40"/>
+          <w:szCs w:val="40"/>
+        </w:rPr>
+        <w:lastRenderedPageBreak/>
+        <w:drawing>
+          <wp:inline distT="0" distB="0" distL="0" distR="0" wp14:anchorId="39DFE9BB" wp14:editId="5E167FD4">
+            <wp:extent cx="5197290" cy="5006774"/>
+            <wp:effectExtent l="0" t="0" r="3810" b="3810"/>
+            <wp:docPr id="761124630" name="Picture 1"/>
+            <wp:cNvGraphicFramePr>
+              <a:graphicFrameLocks xmlns:a="http://schemas.openxmlformats.org/drawingml/2006/main" noChangeAspect="1"/>
+            </wp:cNvGraphicFramePr>
+            <a:graphic xmlns:a="http://schemas.openxmlformats.org/drawingml/2006/main">
+              <a:graphicData uri="http://schemas.openxmlformats.org/drawingml/2006/picture">
+                <pic:pic xmlns:pic="http://schemas.openxmlformats.org/drawingml/2006/picture">
+                  <pic:nvPicPr>
+                    <pic:cNvPr id="761124630" name=""/>
+                    <pic:cNvPicPr/>
+                  </pic:nvPicPr>
+                  <pic:blipFill>
+                    <a:blip r:embed="rId22"/>
+                    <a:stretch>
+                      <a:fillRect/>
+                    </a:stretch>
+                  </pic:blipFill>
+                  <pic:spPr>
+                    <a:xfrm>
+                      <a:off x="0" y="0"/>
+                      <a:ext cx="5197290" cy="5006774"/>
+                    </a:xfrm>
+                    <a:prstGeom prst="rect">
+                      <a:avLst/>
+                    </a:prstGeom>
+                  </pic:spPr>
+                </pic:pic>
+              </a:graphicData>
+            </a:graphic>
+          </wp:inline>
+        </w:drawing>
+      </w:r>
+    </w:p>
+    <w:p>
+      <w:pPr>
+        <w:pBdr>
+          <w:top w:val="single" w:sz="4" w:space="8" w:color="D1D5DB"/>
+        </w:pBdr>
+        <w:spacing w:before="240" w:after="80"/>
+        <w:rPr>
+          <w:sz w:val="40"/>
+          <w:szCs w:val="40"/>
+        </w:rPr>
+      </w:pPr>
+    </w:p>
+    <w:p>
+      <w:pPr>
+        <w:pBdr>
+          <w:top w:val="single" w:sz="4" w:space="8" w:color="D1D5DB"/>
+        </w:pBdr>
+        <w:spacing w:before="240" w:after="80"/>
+        <w:rPr>
+          <w:sz w:val="40"/>
+          <w:szCs w:val="40"/>
+        </w:rPr>
+      </w:pPr>
+      <w:r>
+        <w:rPr>
+          <w:sz w:val="40"/>
+          <w:szCs w:val="40"/>
+        </w:rPr>
+        <w:t>Production Principles:</w:t>
+      </w:r>
+    </w:p>
+    <w:p>
+      <w:pPr>
+        <w:pBdr>
+          <w:top w:val="single" w:sz="4" w:space="8" w:color="D1D5DB"/>
+        </w:pBdr>
+        <w:spacing w:before="240" w:after="80"/>
+        <w:ind w:firstLine="720"/>
+        <w:rPr>
+          <w:sz w:val="24"/>
+          <w:szCs w:val="24"/>
+        </w:rPr>
+      </w:pPr>
+      <w:r>
+        <w:rPr>
+          <w:sz w:val="24"/>
+          <w:szCs w:val="24"/>
+        </w:rPr>
+        <w:t>Reliability</w:t>
+      </w:r>
+    </w:p>
+    <w:p>
+      <w:pPr>
+        <w:pBdr>
+          <w:top w:val="single" w:sz="4" w:space="8" w:color="D1D5DB"/>
+        </w:pBdr>
+        <w:spacing w:before="240" w:after="80"/>
+        <w:ind w:firstLine="720"/>
+        <w:rPr>
+          <w:sz w:val="24"/>
+          <w:szCs w:val="24"/>
+        </w:rPr>
+      </w:pPr>
+      <w:r>
+        <w:rPr>
+          <w:sz w:val="24"/>
+          <w:szCs w:val="24"/>
+        </w:rPr>
+        <w:lastRenderedPageBreak/>
+        <w:drawing>
+          <wp:inline distT="0" distB="0" distL="0" distR="0" wp14:anchorId="2AA09A40" wp14:editId="746384EF">
+            <wp:extent cx="5943600" cy="1931670"/>
+            <wp:effectExtent l="0" t="0" r="0" b="0"/>
+            <wp:docPr id="1755978930" name="Picture 1"/>
+            <wp:cNvGraphicFramePr>
+              <a:graphicFrameLocks xmlns:a="http://schemas.openxmlformats.org/drawingml/2006/main" noChangeAspect="1"/>
+            </wp:cNvGraphicFramePr>
+            <a:graphic xmlns:a="http://schemas.openxmlformats.org/drawingml/2006/main">
+              <a:graphicData uri="http://schemas.openxmlformats.org/drawingml/2006/picture">
+                <pic:pic xmlns:pic="http://schemas.openxmlformats.org/drawingml/2006/picture">
+                  <pic:nvPicPr>
+                    <pic:cNvPr id="1755978930" name=""/>
+                    <pic:cNvPicPr/>
+                  </pic:nvPicPr>
+                  <pic:blipFill>
+                    <a:blip r:embed="rId23"/>
+                    <a:stretch>
+                      <a:fillRect/>
+                    </a:stretch>
+                  </pic:blipFill>
+                  <pic:spPr>
+                    <a:xfrm>
+                      <a:off x="0" y="0"/>
+                      <a:ext cx="5943600" cy="1931670"/>
+                    </a:xfrm>
+                    <a:prstGeom prst="rect">
+                      <a:avLst/>
+                    </a:prstGeom>
+                  </pic:spPr>
+                </pic:pic>
+              </a:graphicData>
+            </a:graphic>
+          </wp:inline>
+        </w:drawing>
+      </w:r>
+    </w:p>
+    <w:p>
+      <w:pPr>
+        <w:pBdr>
+          <w:top w:val="single" w:sz="4" w:space="8" w:color="D1D5DB"/>
+        </w:pBdr>
+        <w:spacing w:before="240" w:after="80"/>
+        <w:ind w:firstLine="720"/>
+        <w:rPr>
+          <w:sz w:val="24"/>
+          <w:szCs w:val="24"/>
+        </w:rPr>
+      </w:pPr>
+      <w:r>
+        <w:rPr>
+          <w:sz w:val="24"/>
+          <w:szCs w:val="24"/>
+        </w:rPr>
+        <w:drawing>
+          <wp:inline distT="0" distB="0" distL="0" distR="0" wp14:anchorId="4D51A6E8" wp14:editId="507CEAC5">
+            <wp:extent cx="3825572" cy="2872989"/>
+            <wp:effectExtent l="0" t="0" r="3810" b="3810"/>
+            <wp:docPr id="1627084184" name="Picture 1"/>
+            <wp:cNvGraphicFramePr>
+              <a:graphicFrameLocks xmlns:a="http://schemas.openxmlformats.org/drawingml/2006/main" noChangeAspect="1"/>
+            </wp:cNvGraphicFramePr>
+            <a:graphic xmlns:a="http://schemas.openxmlformats.org/drawingml/2006/main">
+              <a:graphicData uri="http://schemas.openxmlformats.org/drawingml/2006/picture">
+                <pic:pic xmlns:pic="http://schemas.openxmlformats.org/drawingml/2006/picture">
+                  <pic:nvPicPr>
+                    <pic:cNvPr id="1627084184" name=""/>
+                    <pic:cNvPicPr/>
+                  </pic:nvPicPr>
+                  <pic:blipFill>
+                    <a:blip r:embed="rId24"/>
+                    <a:stretch>
+                      <a:fillRect/>
+                    </a:stretch>
+                  </pic:blipFill>
+                  <pic:spPr>
+                    <a:xfrm>
+                      <a:off x="0" y="0"/>
+                      <a:ext cx="3825572" cy="2872989"/>
+                    </a:xfrm>
+                    <a:prstGeom prst="rect">
+                      <a:avLst/>
+                    </a:prstGeom>
+                  </pic:spPr>
+                </pic:pic>
+              </a:graphicData>
+            </a:graphic>
+          </wp:inline>
+        </w:drawing>
+      </w:r>
+    </w:p>
+    <w:p>
+      <w:pPr>
+        <w:pBdr>
+          <w:top w:val="single" w:sz="4" w:space="8" w:color="D1D5DB"/>
+        </w:pBdr>
+        <w:spacing w:before="240" w:after="80"/>
+        <w:ind w:firstLine="720"/>
+        <w:rPr>
+          <w:sz w:val="24"/>
+          <w:szCs w:val="24"/>
+        </w:rPr>
+      </w:pPr>
+    </w:p>
+    <w:p>
+      <w:pPr>
+        <w:pBdr>
+          <w:top w:val="single" w:sz="4" w:space="8" w:color="D1D5DB"/>
+        </w:pBdr>
+        <w:spacing w:before="240" w:after="80"/>
+        <w:ind w:firstLine="720"/>
+        <w:rPr>
+          <w:sz w:val="24"/>
+          <w:szCs w:val="24"/>
+        </w:rPr>
+      </w:pPr>
+    </w:p>
+    <w:p>
+      <w:pPr>
+        <w:pBdr>
+          <w:top w:val="single" w:sz="4" w:space="8" w:color="D1D5DB"/>
+        </w:pBdr>
+        <w:spacing w:before="240" w:after="80"/>
+        <w:ind w:firstLine="720"/>
+        <w:rPr>
+          <w:sz w:val="24"/>
+          <w:szCs w:val="24"/>
+        </w:rPr>
+      </w:pPr>
+      <w:r>
+        <w:rPr>
+          <w:sz w:val="24"/>
+          <w:szCs w:val="24"/>
+        </w:rPr>
+        <w:t>Cost &amp; Latency:</w:t>
+      </w:r>
+    </w:p>
+    <w:p>
+      <w:pPr>
+        <w:pBdr>
+          <w:top w:val="single" w:sz="4" w:space="8" w:color="D1D5DB"/>
+        </w:pBdr>
+        <w:spacing w:before="240" w:after="80"/>
+        <w:ind w:firstLine="720"/>
+        <w:rPr>
+          <w:sz w:val="24"/>
+          <w:szCs w:val="24"/>
+        </w:rPr>
+      </w:pPr>
+      <w:r>
+        <w:rPr>
+          <w:sz w:val="24"/>
+          <w:szCs w:val="24"/>
+        </w:rPr>
+        <w:lastRenderedPageBreak/>
+        <w:drawing>
+          <wp:inline distT="0" distB="0" distL="0" distR="0" wp14:anchorId="101FC955" wp14:editId="2E7B7A3A">
+            <wp:extent cx="3543607" cy="7018628"/>
+            <wp:effectExtent l="0" t="0" r="0" b="0"/>
+            <wp:docPr id="812965252" name="Picture 1"/>
+            <wp:cNvGraphicFramePr>
+              <a:graphicFrameLocks xmlns:a="http://schemas.openxmlformats.org/drawingml/2006/main" noChangeAspect="1"/>
+            </wp:cNvGraphicFramePr>
+            <a:graphic xmlns:a="http://schemas.openxmlformats.org/drawingml/2006/main">
+              <a:graphicData uri="http://schemas.openxmlformats.org/drawingml/2006/picture">
+                <pic:pic xmlns:pic="http://schemas.openxmlformats.org/drawingml/2006/picture">
+                  <pic:nvPicPr>
+                    <pic:cNvPr id="812965252" name=""/>
+                    <pic:cNvPicPr/>
+                  </pic:nvPicPr>
+                  <pic:blipFill>
+                    <a:blip r:embed="rId25"/>
+                    <a:stretch>
+                      <a:fillRect/>
+                    </a:stretch>
+                  </pic:blipFill>
+                  <pic:spPr>
+                    <a:xfrm>
+                      <a:off x="0" y="0"/>
+                      <a:ext cx="3543607" cy="7018628"/>
+                    </a:xfrm>
+                    <a:prstGeom prst="rect">
+                      <a:avLst/>
+                    </a:prstGeom>
+                  </pic:spPr>
+                </pic:pic>
+              </a:graphicData>
+            </a:graphic>
+          </wp:inline>
+        </w:drawing>
+      </w:r>
+    </w:p>
+    <w:p>
+      <w:pPr>
+        <w:pBdr>
+          <w:top w:val="single" w:sz="4" w:space="8" w:color="D1D5DB"/>
+        </w:pBdr>
+        <w:spacing w:before="240" w:after="80"/>
+        <w:ind w:firstLine="720"/>
+        <w:rPr>
+          <w:sz w:val="24"/>
+          <w:szCs w:val="24"/>
+        </w:rPr>
+      </w:pPr>
+    </w:p>
+    <w:p>
+      <w:pPr>
+        <w:pBdr>
+          <w:top w:val="single" w:sz="4" w:space="8" w:color="D1D5DB"/>
+        </w:pBdr>
+        <w:spacing w:before="240" w:after="80"/>
+        <w:ind w:firstLine="720"/>
+        <w:rPr>
+          <w:sz w:val="24"/>
+          <w:szCs w:val="24"/>
+        </w:rPr>
+      </w:pPr>
+      <w:r>
+        <w:rPr>
+          <w:sz w:val="24"/>
+          <w:szCs w:val="24"/>
+        </w:rPr>
+        <w:lastRenderedPageBreak/>
+        <w:drawing>
+          <wp:inline distT="0" distB="0" distL="0" distR="0" wp14:anchorId="1914C9E3" wp14:editId="3DDE2B42">
+            <wp:extent cx="5943600" cy="2567305"/>
+            <wp:effectExtent l="0" t="0" r="0" b="4445"/>
+            <wp:docPr id="1393676175" name="Picture 1"/>
+            <wp:cNvGraphicFramePr>
+              <a:graphicFrameLocks xmlns:a="http://schemas.openxmlformats.org/drawingml/2006/main" noChangeAspect="1"/>
+            </wp:cNvGraphicFramePr>
+            <a:graphic xmlns:a="http://schemas.openxmlformats.org/drawingml/2006/main">
+              <a:graphicData uri="http://schemas.openxmlformats.org/drawingml/2006/picture">
+                <pic:pic xmlns:pic="http://schemas.openxmlformats.org/drawingml/2006/picture">
+                  <pic:nvPicPr>
+                    <pic:cNvPr id="1393676175" name=""/>
+                    <pic:cNvPicPr/>
+                  </pic:nvPicPr>
+                  <pic:blipFill>
+                    <a:blip r:embed="rId26"/>
+                    <a:stretch>
+                      <a:fillRect/>
+                    </a:stretch>
+                  </pic:blipFill>
+                  <pic:spPr>
+                    <a:xfrm>
+                      <a:off x="0" y="0"/>
+                      <a:ext cx="5943600" cy="2567305"/>
+                    </a:xfrm>
+                    <a:prstGeom prst="rect">
+                      <a:avLst/>
+                    </a:prstGeom>
+                  </pic:spPr>
+                </pic:pic>
+              </a:graphicData>
+            </a:graphic>
+          </wp:inline>
+        </w:drawing>
+      </w:r>
+    </w:p>
+    <w:p>
+      <w:pPr>
+        <w:pBdr>
+          <w:top w:val="single" w:sz="4" w:space="8" w:color="D1D5DB"/>
+        </w:pBdr>
+        <w:spacing w:before="240" w:after="80"/>
+        <w:ind w:firstLine="720"/>
+        <w:rPr>
+          <w:sz w:val="24"/>
+          <w:szCs w:val="24"/>
+        </w:rPr>
+      </w:pPr>
+      <w:r>
+        <w:rPr>
+          <w:sz w:val="24"/>
+          <w:szCs w:val="24"/>
+        </w:rPr>
+        <w:t>Batching &amp; Asynchronous execution for non-blocking work like e</w:t>
+      </w:r>
+      <w:r>
+        <w:rPr>
+          <w:sz w:val="24"/>
+          <w:szCs w:val="24"/>
+        </w:rPr>
+        <w:t>valuations or something like that</w:t>
+      </w:r>
+    </w:p>
+    <w:p>
+      <w:pPr>
+        <w:pBdr>
+          <w:top w:val="single" w:sz="4" w:space="8" w:color="D1D5DB"/>
+        </w:pBdr>
+        <w:spacing w:before="240" w:after="80"/>
+        <w:ind w:firstLine="720"/>
+        <w:rPr>
+          <w:sz w:val="24"/>
+          <w:szCs w:val="24"/>
+        </w:rPr>
+      </w:pPr>
+      <w:r>
+        <w:rPr>
+          <w:sz w:val="24"/>
+          <w:szCs w:val="24"/>
+        </w:rPr>
+        <w:t>Always streaming response for</w:t>
+      </w:r>
+      <w:r>
+        <w:rPr>
+          <w:sz w:val="24"/>
+          <w:szCs w:val="24"/>
+        </w:rPr>
+        <w:t xml:space="preserve"> the</w:t>
+      </w:r>
+      <w:r>
+        <w:rPr>
+          <w:sz w:val="24"/>
+          <w:szCs w:val="24"/>
+        </w:rPr>
+        <w:t xml:space="preserve"> response may take time</w:t>
+      </w:r>
+    </w:p>
+    <w:p>
+      <w:pPr>
+        <w:pBdr>
+          <w:top w:val="single" w:sz="4" w:space="8" w:color="D1D5DB"/>
+        </w:pBdr>
+        <w:spacing w:before="240" w:after="80"/>
+        <w:ind w:firstLine="720"/>
+        <w:rPr>
+          <w:sz w:val="24"/>
+          <w:szCs w:val="24"/>
+        </w:rPr>
+      </w:pPr>
+    </w:p>
+    <w:p>
+      <w:pPr>
+        <w:pBdr>
+          <w:top w:val="single" w:sz="4" w:space="8" w:color="D1D5DB"/>
+        </w:pBdr>
+        <w:spacing w:before="240" w:after="80"/>
+        <w:ind w:firstLine="720"/>
+        <w:rPr>
+          <w:sz w:val="24"/>
+          <w:szCs w:val="24"/>
+        </w:rPr>
+      </w:pPr>
+      <w:r>
+        <w:rPr>
+          <w:sz w:val="24"/>
+          <w:szCs w:val="24"/>
+        </w:rPr>
+        <w:drawing>
+          <wp:inline distT="0" distB="0" distL="0" distR="0" wp14:anchorId="7E40A701" wp14:editId="661B7F44">
+            <wp:extent cx="5943600" cy="483235"/>
+            <wp:effectExtent l="0" t="0" r="0" b="0"/>
+            <wp:docPr id="1355708035" name="Picture 1"/>
+            <wp:cNvGraphicFramePr>
+              <a:graphicFrameLocks xmlns:a="http://schemas.openxmlformats.org/drawingml/2006/main" noChangeAspect="1"/>
+            </wp:cNvGraphicFramePr>
+            <a:graphic xmlns:a="http://schemas.openxmlformats.org/drawingml/2006/main">
+              <a:graphicData uri="http://schemas.openxmlformats.org/drawingml/2006/picture">
+                <pic:pic xmlns:pic="http://schemas.openxmlformats.org/drawingml/2006/picture">
+                  <pic:nvPicPr>
+                    <pic:cNvPr id="1355708035" name=""/>
+                    <pic:cNvPicPr/>
+                  </pic:nvPicPr>
+                  <pic:blipFill>
+                    <a:blip r:embed="rId27"/>
+                    <a:stretch>
+                      <a:fillRect/>
+                    </a:stretch>
+                  </pic:blipFill>
+                  <pic:spPr>
+                    <a:xfrm>
+                      <a:off x="0" y="0"/>
+                      <a:ext cx="5943600" cy="483235"/>
+                    </a:xfrm>
+                    <a:prstGeom prst="rect">
+                      <a:avLst/>
+                    </a:prstGeom>
+                  </pic:spPr>
+                </pic:pic>
+              </a:graphicData>
+            </a:graphic>
+          </wp:inline>
+        </w:drawing>
+      </w:r>
+    </w:p>
+    <w:p>
+      <w:pPr>
+        <w:pBdr>
+          <w:top w:val="single" w:sz="4" w:space="8" w:color="D1D5DB"/>
+        </w:pBdr>
+        <w:spacing w:before="240" w:after="80"/>
+        <w:ind w:firstLine="720"/>
+        <w:rPr>
+          <w:sz w:val="24"/>
+          <w:szCs w:val="24"/>
+        </w:rPr>
+      </w:pPr>
+    </w:p>
+    <w:p>
+      <w:pPr>
+        <w:pBdr>
+          <w:top w:val="single" w:sz="4" w:space="8" w:color="D1D5DB"/>
+        </w:pBdr>
+        <w:spacing w:before="240" w:after="80"/>
+        <w:ind w:firstLine="720"/>
+        <w:rPr>
+          <w:sz w:val="24"/>
+          <w:szCs w:val="24"/>
+        </w:rPr>
+      </w:pPr>
+    </w:p>
+    <w:p>
+      <w:pPr>
+        <w:pBdr>
+          <w:top w:val="single" w:sz="4" w:space="8" w:color="D1D5DB"/>
+        </w:pBdr>
+        <w:spacing w:before="240" w:after="80"/>
+        <w:ind w:firstLine="720"/>
+        <w:rPr>
+          <w:sz w:val="24"/>
+          <w:szCs w:val="24"/>
+        </w:rPr>
+      </w:pPr>
+      <w:r>
+        <w:rPr>
+          <w:sz w:val="24"/>
+          <w:szCs w:val="24"/>
+        </w:rPr>
+        <w:t>Co</w:t>
+      </w:r>
+      <w:r>
+        <w:rPr>
+          <w:sz w:val="24"/>
+          <w:szCs w:val="24"/>
+        </w:rPr>
+        <w:t>ntext</w:t>
+      </w:r>
+      <w:r>
+        <w:rPr>
+          <w:sz w:val="24"/>
+          <w:szCs w:val="24"/>
+        </w:rPr>
+        <w:t xml:space="preserve"> &amp; </w:t>
+      </w:r>
+      <w:r>
+        <w:rPr>
+          <w:sz w:val="24"/>
+          <w:szCs w:val="24"/>
+        </w:rPr>
+        <w:t>RAG design</w:t>
+      </w:r>
+      <w:r>
+        <w:rPr>
+          <w:sz w:val="24"/>
+          <w:szCs w:val="24"/>
+        </w:rPr>
+        <w:t>:</w:t>
+      </w:r>
+    </w:p>
+    <w:p>
+      <w:pPr>
+        <w:pBdr>
+          <w:top w:val="single" w:sz="4" w:space="8" w:color="D1D5DB"/>
+        </w:pBdr>
+        <w:spacing w:before="240" w:after="80"/>
+        <w:ind w:firstLine="720"/>
+        <w:rPr>
+          <w:sz w:val="24"/>
+          <w:szCs w:val="24"/>
+        </w:rPr>
+      </w:pPr>
+      <w:r>
+        <w:rPr>
+          <w:sz w:val="24"/>
+          <w:szCs w:val="24"/>
+        </w:rPr>
+        <w:drawing>
+          <wp:inline distT="0" distB="0" distL="0" distR="0" wp14:anchorId="7997D215" wp14:editId="2366BD67">
+            <wp:extent cx="5943600" cy="1880235"/>
+            <wp:effectExtent l="0" t="0" r="0" b="5715"/>
+            <wp:docPr id="295275212" name="Picture 1"/>
+            <wp:cNvGraphicFramePr>
+              <a:graphicFrameLocks xmlns:a="http://schemas.openxmlformats.org/drawingml/2006/main" noChangeAspect="1"/>
+            </wp:cNvGraphicFramePr>
+            <a:graphic xmlns:a="http://schemas.openxmlformats.org/drawingml/2006/main">
+              <a:graphicData uri="http://schemas.openxmlformats.org/drawingml/2006/picture">
+                <pic:pic xmlns:pic="http://schemas.openxmlformats.org/drawingml/2006/picture">
+                  <pic:nvPicPr>
+                    <pic:cNvPr id="295275212" name=""/>
+                    <pic:cNvPicPr/>
+                  </pic:nvPicPr>
+                  <pic:blipFill>
+                    <a:blip r:embed="rId28"/>
+                    <a:stretch>
+                      <a:fillRect/>
+                    </a:stretch>
+                  </pic:blipFill>
+                  <pic:spPr>
+                    <a:xfrm>
+                      <a:off x="0" y="0"/>
+                      <a:ext cx="5943600" cy="1880235"/>
+                    </a:xfrm>
+                    <a:prstGeom prst="rect">
+                      <a:avLst/>
+                    </a:prstGeom>
+                  </pic:spPr>
+                </pic:pic>
+              </a:graphicData>
+            </a:graphic>
+          </wp:inline>
+        </w:drawing>
+      </w:r>
+    </w:p>
+    <w:p>
+      <w:pPr>
+        <w:pBdr>
+          <w:top w:val="single" w:sz="4" w:space="8" w:color="D1D5DB"/>
+        </w:pBdr>
+        <w:spacing w:before="240" w:after="80"/>
+        <w:ind w:firstLine="720"/>
+        <w:rPr>
+          <w:sz w:val="24"/>
+          <w:szCs w:val="24"/>
+        </w:rPr>
+      </w:pPr>
+      <w:r>
+        <w:rPr>
+          <w:sz w:val="24"/>
+          <w:szCs w:val="24"/>
+        </w:rPr>
+        <w:t>RAG: retrieval quality matters more than simply having vector Database</w:t>
+      </w:r>
+      <w:r>
+        <w:rPr>
+          <w:sz w:val="24"/>
+          <w:szCs w:val="24"/>
+        </w:rPr>
+        <w:t>, you need to do document chunking, metadata filter, hybrid search, Re-Ranking, freshness controls and source attributes when the user needs trust.</w:t>
+      </w:r>
+    </w:p>
+    <w:p>
+      <w:pPr>
+        <w:pBdr>
+          <w:top w:val="single" w:sz="4" w:space="8" w:color="D1D5DB"/>
+        </w:pBdr>
+        <w:spacing w:before="240" w:after="80"/>
+        <w:ind w:firstLine="720"/>
+        <w:rPr>
+          <w:sz w:val="24"/>
+          <w:szCs w:val="24"/>
+        </w:rPr>
+      </w:pPr>
+      <w:r>
+        <w:rPr>
+          <w:sz w:val="24"/>
+          <w:szCs w:val="24"/>
+        </w:rPr>
+        <w:lastRenderedPageBreak/>
+        <w:drawing>
+          <wp:inline distT="0" distB="0" distL="0" distR="0" wp14:anchorId="1B87F0A3" wp14:editId="07D34B06">
+            <wp:extent cx="5943600" cy="1043305"/>
+            <wp:effectExtent l="0" t="0" r="0" b="4445"/>
+            <wp:docPr id="149092502" name="Picture 1"/>
+            <wp:cNvGraphicFramePr>
+              <a:graphicFrameLocks xmlns:a="http://schemas.openxmlformats.org/drawingml/2006/main" noChangeAspect="1"/>
+            </wp:cNvGraphicFramePr>
+            <a:graphic xmlns:a="http://schemas.openxmlformats.org/drawingml/2006/main">
+              <a:graphicData uri="http://schemas.openxmlformats.org/drawingml/2006/picture">
+                <pic:pic xmlns:pic="http://schemas.openxmlformats.org/drawingml/2006/picture">
+                  <pic:nvPicPr>
+                    <pic:cNvPr id="149092502" name=""/>
+                    <pic:cNvPicPr/>
+                  </pic:nvPicPr>
+                  <pic:blipFill>
+                    <a:blip r:embed="rId29"/>
+                    <a:stretch>
+                      <a:fillRect/>
+                    </a:stretch>
+                  </pic:blipFill>
+                  <pic:spPr>
+                    <a:xfrm>
+                      <a:off x="0" y="0"/>
+                      <a:ext cx="5943600" cy="1043305"/>
+                    </a:xfrm>
+                    <a:prstGeom prst="rect">
+                      <a:avLst/>
+                    </a:prstGeom>
+                  </pic:spPr>
+                </pic:pic>
+              </a:graphicData>
+            </a:graphic>
+          </wp:inline>
+        </w:drawing>
+      </w:r>
+    </w:p>
+    <w:p>
+      <w:pPr>
+        <w:pBdr>
+          <w:top w:val="single" w:sz="4" w:space="8" w:color="D1D5DB"/>
+        </w:pBdr>
+        <w:spacing w:before="240" w:after="80"/>
+        <w:ind w:firstLine="720"/>
+        <w:rPr>
+          <w:sz w:val="24"/>
+          <w:szCs w:val="24"/>
+        </w:rPr>
+      </w:pPr>
+      <w:r>
+        <w:rPr>
+          <w:sz w:val="24"/>
+          <w:szCs w:val="24"/>
+        </w:rPr>
+        <w:t>Retrieve documents should not allow to overwrite the system instruction, tool output should be treated as data not instruction</w:t>
+      </w:r>
+    </w:p>
+    <w:p>
+      <w:pPr>
+        <w:pBdr>
+          <w:top w:val="single" w:sz="4" w:space="8" w:color="D1D5DB"/>
+        </w:pBdr>
+        <w:spacing w:before="240" w:after="80"/>
+        <w:ind w:firstLine="720"/>
+        <w:rPr>
+          <w:sz w:val="24"/>
+          <w:szCs w:val="24"/>
+        </w:rPr>
+      </w:pPr>
+    </w:p>
+    <w:p>
+      <w:pPr>
+        <w:pBdr>
+          <w:top w:val="single" w:sz="4" w:space="8" w:color="D1D5DB"/>
+        </w:pBdr>
+        <w:spacing w:before="240" w:after="80"/>
+        <w:rPr>
+          <w:sz w:val="24"/>
+          <w:szCs w:val="24"/>
+        </w:rPr>
+      </w:pPr>
+      <w:r>
+        <w:rPr>
+          <w:sz w:val="24"/>
+          <w:szCs w:val="24"/>
+        </w:rPr>
+        <w:t>Observability, Security &amp; Privacy:</w:t>
+      </w:r>
+    </w:p>
+    <w:p>
+      <w:pPr>
+        <w:pBdr>
+          <w:top w:val="single" w:sz="4" w:space="8" w:color="D1D5DB"/>
+        </w:pBdr>
+        <w:spacing w:before="240" w:after="80"/>
+        <w:rPr>
+          <w:sz w:val="24"/>
+          <w:szCs w:val="24"/>
+        </w:rPr>
+      </w:pPr>
+    </w:p>
+    <w:p>
+      <w:pPr>
+        <w:pBdr>
+          <w:top w:val="single" w:sz="4" w:space="8" w:color="D1D5DB"/>
+        </w:pBdr>
+        <w:spacing w:before="240" w:after="80"/>
+        <w:rPr>
+          <w:sz w:val="24"/>
+          <w:szCs w:val="24"/>
+        </w:rPr>
+      </w:pPr>
+      <w:r>
+        <w:rPr>
+          <w:sz w:val="24"/>
+          <w:szCs w:val="24"/>
+        </w:rPr>
+        <w:t>Observability:</w:t>
+      </w:r>
+    </w:p>
+    <w:p>
+      <w:pPr>
+        <w:pBdr>
+          <w:top w:val="single" w:sz="4" w:space="8" w:color="D1D5DB"/>
+        </w:pBdr>
+        <w:spacing w:before="240" w:after="80"/>
+      </w:pPr>
+      <w:r>
+        <w:drawing>
+          <wp:inline distT="0" distB="0" distL="0" distR="0" wp14:anchorId="7982CB61" wp14:editId="773475FA">
+            <wp:extent cx="5943600" cy="2019935"/>
+            <wp:effectExtent l="0" t="0" r="0" b="0"/>
+            <wp:docPr id="228689825" name="Picture 1"/>
+            <wp:cNvGraphicFramePr>
+              <a:graphicFrameLocks xmlns:a="http://schemas.openxmlformats.org/drawingml/2006/main" noChangeAspect="1"/>
+            </wp:cNvGraphicFramePr>
+            <a:graphic xmlns:a="http://schemas.openxmlformats.org/drawingml/2006/main">
+              <a:graphicData uri="http://schemas.openxmlformats.org/drawingml/2006/picture">
+                <pic:pic xmlns:pic="http://schemas.openxmlformats.org/drawingml/2006/picture">
+                  <pic:nvPicPr>
+                    <pic:cNvPr id="228689825" name=""/>
+                    <pic:cNvPicPr/>
+                  </pic:nvPicPr>
+                  <pic:blipFill>
+                    <a:blip r:embed="rId30"/>
+                    <a:stretch>
+                      <a:fillRect/>
+                    </a:stretch>
+                  </pic:blipFill>
+                  <pic:spPr>
+                    <a:xfrm>
+                      <a:off x="0" y="0"/>
+                      <a:ext cx="5943600" cy="2019935"/>
+                    </a:xfrm>
+                    <a:prstGeom prst="rect">
+                      <a:avLst/>
+                    </a:prstGeom>
+                  </pic:spPr>
+                </pic:pic>
+              </a:graphicData>
+            </a:graphic>
+          </wp:inline>
+        </w:drawing>
+      </w:r>
+    </w:p>
+    <w:p>
+      <w:pPr>
+        <w:pBdr>
+          <w:top w:val="single" w:sz="4" w:space="8" w:color="D1D5DB"/>
+        </w:pBdr>
+        <w:spacing w:before="240" w:after="80"/>
+      </w:pPr>
+    </w:p>
+    <w:p>
+      <w:pPr>
+        <w:pBdr>
+          <w:top w:val="single" w:sz="4" w:space="8" w:color="D1D5DB"/>
+        </w:pBdr>
+        <w:spacing w:before="240" w:after="80"/>
+      </w:pPr>
+      <w:r>
+        <w:t xml:space="preserve">Security: </w:t>
+      </w:r>
+      <w:r>
+        <w:drawing>
+          <wp:inline distT="0" distB="0" distL="0" distR="0" wp14:anchorId="14AD1B77" wp14:editId="3D6C35DE">
+            <wp:extent cx="5943600" cy="600710"/>
+            <wp:effectExtent l="0" t="0" r="0" b="8890"/>
+            <wp:docPr id="370584322" name="Picture 1"/>
+            <wp:cNvGraphicFramePr>
+              <a:graphicFrameLocks xmlns:a="http://schemas.openxmlformats.org/drawingml/2006/main" noChangeAspect="1"/>
+            </wp:cNvGraphicFramePr>
+            <a:graphic xmlns:a="http://schemas.openxmlformats.org/drawingml/2006/main">
+              <a:graphicData uri="http://schemas.openxmlformats.org/drawingml/2006/picture">
+                <pic:pic xmlns:pic="http://schemas.openxmlformats.org/drawingml/2006/picture">
+                  <pic:nvPicPr>
+                    <pic:cNvPr id="370584322" name=""/>
+                    <pic:cNvPicPr/>
+                  </pic:nvPicPr>
+                  <pic:blipFill>
+                    <a:blip r:embed="rId31"/>
+                    <a:stretch>
+                      <a:fillRect/>
+                    </a:stretch>
+                  </pic:blipFill>
+                  <pic:spPr>
+                    <a:xfrm>
+                      <a:off x="0" y="0"/>
+                      <a:ext cx="5943600" cy="600710"/>
+                    </a:xfrm>
+                    <a:prstGeom prst="rect">
+                      <a:avLst/>
+                    </a:prstGeom>
+                  </pic:spPr>
+                </pic:pic>
+              </a:graphicData>
+            </a:graphic>
+          </wp:inline>
+        </w:drawing>
+      </w:r>
+    </w:p>
+    <w:p>
+      <w:pPr>
+        <w:pBdr>
+          <w:top w:val="single" w:sz="4" w:space="8" w:color="D1D5DB"/>
+        </w:pBdr>
+        <w:spacing w:before="240" w:after="80"/>
+      </w:pPr>
+    </w:p>
+    <w:p>
+      <w:pPr>
+        <w:pBdr>
+          <w:top w:val="single" w:sz="4" w:space="8" w:color="D1D5DB"/>
+        </w:pBdr>
+        <w:spacing w:before="240" w:after="80"/>
+      </w:pPr>
+      <w:r>
+        <w:t>Privacy</w:t>
+      </w:r>
+      <w:r>
+        <w:t xml:space="preserve"> for boundary:</w:t>
+      </w:r>
+    </w:p>
+    <w:p>
+      <w:pPr>
+        <w:pBdr>
+          <w:top w:val="single" w:sz="4" w:space="8" w:color="D1D5DB"/>
+        </w:pBdr>
+        <w:spacing w:before="240" w:after="80"/>
+      </w:pPr>
+      <w:r>
+        <w:lastRenderedPageBreak/>
+        <w:drawing>
+          <wp:inline distT="0" distB="0" distL="0" distR="0" wp14:anchorId="12B396BD" wp14:editId="0EAA83D7">
+            <wp:extent cx="4473328" cy="4244708"/>
+            <wp:effectExtent l="0" t="0" r="3810" b="3810"/>
+            <wp:docPr id="1217211877" name="Picture 1"/>
+            <wp:cNvGraphicFramePr>
+              <a:graphicFrameLocks xmlns:a="http://schemas.openxmlformats.org/drawingml/2006/main" noChangeAspect="1"/>
+            </wp:cNvGraphicFramePr>
+            <a:graphic xmlns:a="http://schemas.openxmlformats.org/drawingml/2006/main">
+              <a:graphicData uri="http://schemas.openxmlformats.org/drawingml/2006/picture">
+                <pic:pic xmlns:pic="http://schemas.openxmlformats.org/drawingml/2006/picture">
+                  <pic:nvPicPr>
+                    <pic:cNvPr id="1217211877" name=""/>
+                    <pic:cNvPicPr/>
+                  </pic:nvPicPr>
+                  <pic:blipFill>
+                    <a:blip r:embed="rId32"/>
+                    <a:stretch>
+                      <a:fillRect/>
+                    </a:stretch>
+                  </pic:blipFill>
+                  <pic:spPr>
+                    <a:xfrm>
+                      <a:off x="0" y="0"/>
+                      <a:ext cx="4473328" cy="4244708"/>
+                    </a:xfrm>
+                    <a:prstGeom prst="rect">
+                      <a:avLst/>
+                    </a:prstGeom>
+                  </pic:spPr>
+                </pic:pic>
+              </a:graphicData>
+            </a:graphic>
+          </wp:inline>
+        </w:drawing>
+      </w:r>
+    </w:p>
+    <w:p>
+      <w:pPr>
+        <w:pBdr>
+          <w:top w:val="single" w:sz="4" w:space="8" w:color="D1D5DB"/>
+        </w:pBdr>
+        <w:spacing w:before="240" w:after="80"/>
+      </w:pPr>
+    </w:p>
+    <w:p>
+      <w:pPr>
+        <w:pBdr>
+          <w:top w:val="single" w:sz="4" w:space="8" w:color="D1D5DB"/>
+        </w:pBdr>
+        <w:spacing w:before="240" w:after="80"/>
+      </w:pPr>
+      <w:r>
+        <w:lastRenderedPageBreak/>
+        <w:drawing>
+          <wp:inline distT="0" distB="0" distL="0" distR="0" wp14:anchorId="78990205" wp14:editId="103A1F68">
+            <wp:extent cx="5943600" cy="3964305"/>
+            <wp:effectExtent l="0" t="0" r="0" b="0"/>
+            <wp:docPr id="1055724625" name="Picture 1"/>
+            <wp:cNvGraphicFramePr>
+              <a:graphicFrameLocks xmlns:a="http://schemas.openxmlformats.org/drawingml/2006/main" noChangeAspect="1"/>
+            </wp:cNvGraphicFramePr>
+            <a:graphic xmlns:a="http://schemas.openxmlformats.org/drawingml/2006/main">
+              <a:graphicData uri="http://schemas.openxmlformats.org/drawingml/2006/picture">
+                <pic:pic xmlns:pic="http://schemas.openxmlformats.org/drawingml/2006/picture">
+                  <pic:nvPicPr>
+                    <pic:cNvPr id="1055724625" name=""/>
+                    <pic:cNvPicPr/>
+                  </pic:nvPicPr>
+                  <pic:blipFill>
+                    <a:blip r:embed="rId33"/>
+                    <a:stretch>
+                      <a:fillRect/>
+                    </a:stretch>
+                  </pic:blipFill>
+                  <pic:spPr>
+                    <a:xfrm>
+                      <a:off x="0" y="0"/>
+                      <a:ext cx="5943600" cy="3964305"/>
+                    </a:xfrm>
+                    <a:prstGeom prst="rect">
+                      <a:avLst/>
+                    </a:prstGeom>
+                  </pic:spPr>
+                </pic:pic>
+              </a:graphicData>
+            </a:graphic>
+          </wp:inline>
+        </w:drawing>
+      </w:r>
+    </w:p>
+    <w:p>
+      <w:pPr>
+        <w:pBdr>
+          <w:top w:val="single" w:sz="4" w:space="8" w:color="D1D5DB"/>
+        </w:pBdr>
+        <w:spacing w:before="240" w:after="80"/>
+        <w:rPr>
+          <w:sz w:val="24"/>
+          <w:szCs w:val="24"/>
+        </w:rPr>
+      </w:pPr>
+      <w:r>
+        <w:t xml:space="preserve">Along with </w:t>
+      </w:r>
+      <w:r>
+        <w:rPr>
+          <w:sz w:val="24"/>
+          <w:szCs w:val="24"/>
+        </w:rPr>
+        <w:t>Observability, Security &amp; Privacy</w:t>
+      </w:r>
+    </w:p>
+    <w:p>
+      <w:pPr>
+        <w:pBdr>
+          <w:top w:val="single" w:sz="4" w:space="8" w:color="D1D5DB"/>
+        </w:pBdr>
+        <w:spacing w:before="240" w:after="80"/>
+        <w:rPr>
+          <w:sz w:val="24"/>
+          <w:szCs w:val="24"/>
+        </w:rPr>
+      </w:pPr>
+    </w:p>
+    <w:p>
+      <w:pPr>
+        <w:pBdr>
+          <w:top w:val="single" w:sz="4" w:space="8" w:color="D1D5DB"/>
+        </w:pBdr>
+        <w:spacing w:before="240" w:after="80"/>
+      </w:pPr>
+      <w:r>
+        <w:drawing>
+          <wp:inline distT="0" distB="0" distL="0" distR="0" wp14:anchorId="3F880D2E" wp14:editId="52F7A85E">
+            <wp:extent cx="5943600" cy="3078480"/>
+            <wp:effectExtent l="0" t="0" r="0" b="7620"/>
+            <wp:docPr id="500934686" name="Picture 1"/>
+            <wp:cNvGraphicFramePr>
+              <a:graphicFrameLocks xmlns:a="http://schemas.openxmlformats.org/drawingml/2006/main" noChangeAspect="1"/>
+            </wp:cNvGraphicFramePr>
+            <a:graphic xmlns:a="http://schemas.openxmlformats.org/drawingml/2006/main">
+              <a:graphicData uri="http://schemas.openxmlformats.org/drawingml/2006/picture">
+                <pic:pic xmlns:pic="http://schemas.openxmlformats.org/drawingml/2006/picture">
+                  <pic:nvPicPr>
+                    <pic:cNvPr id="500934686" name=""/>
+                    <pic:cNvPicPr/>
+                  </pic:nvPicPr>
+                  <pic:blipFill>
+                    <a:blip r:embed="rId34"/>
+                    <a:stretch>
+                      <a:fillRect/>
+                    </a:stretch>
+                  </pic:blipFill>
+                  <pic:spPr>
+                    <a:xfrm>
+                      <a:off x="0" y="0"/>
+                      <a:ext cx="5943600" cy="3078480"/>
+                    </a:xfrm>
+                    <a:prstGeom prst="rect">
+                      <a:avLst/>
+                    </a:prstGeom>
+                  </pic:spPr>
+                </pic:pic>
+              </a:graphicData>
+            </a:graphic>
+          </wp:inline>
+        </w:drawing>
       </w:r>
     </w:p>
     <w:sectPr>
@@ -7363,7 +9489,7 @@
 </file>
 
 <file path=word/numbering.xml><?xml version="1.0" encoding="utf-8"?>
-<w:numbering xmlns:wpc="http://schemas.microsoft.com/office/word/2010/wordprocessingCanvas" xmlns:cx="http://schemas.microsoft.com/office/drawing/2014/chartex" xmlns:cx1="http://schemas.microsoft.com/office/drawing/2015/9/8/chartex" xmlns:cx2="http://schemas.microsoft.com/office/drawing/2015/10/21/chartex" xmlns:cx3="http://schemas.microsoft.com/office/drawing/2016/5/9/chartex" xmlns:cx4="http://schemas.microsoft.com/office/drawing/2016/5/10/chartex" xmlns:cx5="http://schemas.microsoft.com/office/drawing/2016/5/11/chartex" xmlns:cx6="http://schemas.microsoft.com/office/drawing/2016/5/12/chartex" xmlns:cx7="http://schemas.microsoft.com/office/drawing/2016/5/13/chartex" xmlns:cx8="http://schemas.microsoft.com/office/drawing/2016/5/14/chartex" xmlns:mc="http://schemas.openxmlformats.org/markup-compatibility/2006" xmlns:aink="http://schemas.microsoft.com/office/drawing/2016/ink" xmlns:am3d="http://schemas.microsoft.com/office/drawing/2017/model3d" xmlns:o="urn:schemas-microsoft-com:office:office" xmlns:oel="http://schemas.microsoft.com/office/2019/extlst" xmlns:r="http://schemas.openxmlformats.org/officeDocument/2006/relationships" xmlns:m="http://schemas.openxmlformats.org/officeDocument/2006/math" xmlns:v="urn:schemas-microsoft-com:vml" xmlns:wp14="http://schemas.microsoft.com/office/word/2010/wordprocessingDrawing" xmlns:wp="http://schemas.openxmlformats.org/drawingml/2006/wordprocessingDrawing" xmlns:w10="urn:schemas-microsoft-com:office:word" xmlns:w="http://schemas.openxmlformats.org/wordprocessingml/2006/main" xmlns:w14="http://schemas.microsoft.com/office/word/2010/wordml" xmlns:w15="http://schemas.microsoft.com/office/word/2012/wordml" xmlns:w16cex="http://schemas.microsoft.com/office/word/2018/wordml/cex" xmlns:w16cid="http://schemas.microsoft.com/office/word/2016/wordml/cid" xmlns:w16="http://schemas.microsoft.com/office/word/2018/wordml" xmlns:w16du="http://schemas.microsoft.com/office/word/2023/wordml/word16du" xmlns:w16sdtdh="http://schemas.microsoft.com/office/word/2020/wordml/sdtdatahash" xmlns:w16sdtfl="http://schemas.microsoft.com/office/word/2024/wordml/sdtformatlock" xmlns:w16se="http://schemas.microsoft.com/office/word/2015/wordml/symex" xmlns:wpg="http://schemas.microsoft.com/office/word/2010/wordprocessingGroup" xmlns:wpi="http://schemas.microsoft.com/office/word/2010/wordprocessingInk" xmlns:wne="http://schemas.microsoft.com/office/word/2006/wordml" xmlns:wps="http://schemas.microsoft.com/office/word/2010/wordprocessingShape" mc:Ignorable="w14 w15 w16se w16cid w16 w16cex w16sdtdh w16sdtfl w16du wp14">
+<w:numbering xmlns:wpc="http://schemas.microsoft.com/office/word/2010/wordprocessingCanvas" xmlns:cx="http://schemas.microsoft.com/office/drawing/2014/chartex" xmlns:cx1="http://schemas.microsoft.com/office/drawing/2015/9/8/chartex" xmlns:cx2="http://schemas.microsoft.com/office/drawing/2015/10/21/chartex" xmlns:cx3="http://schemas.microsoft.com/office/drawing/2016/5/9/chartex" xmlns:cx4="http://schemas.microsoft.com/office/drawing/2016/5/10/chartex" xmlns:cx5="http://schemas.microsoft.com/office/drawing/2016/5/11/chartex" xmlns:cx6="http://schemas.microsoft.com/office/drawing/2016/5/12/chartex" xmlns:cx7="http://schemas.microsoft.com/office/drawing/2016/5/13/chartex" xmlns:cx8="http://schemas.microsoft.com/office/drawing/2016/5/14/chartex" xmlns:mc="http://schemas.openxmlformats.org/markup-compatibility/2006" xmlns:aink="http://schemas.microsoft.com/office/drawing/2016/ink" xmlns:am3d="http://schemas.microsoft.com/office/drawing/2017/model3d" xmlns:o="urn:schemas-microsoft-com:office:office" xmlns:oel="http://schemas.microsoft.com/office/2019/extlst" xmlns:r="http://schemas.openxmlformats.org/officeDocument/2006/relationships" xmlns:m="http://schemas.openxmlformats.org/officeDocument/2006/math" xmlns:v="urn:schemas-microsoft-com:vml" xmlns:wp14="http://schemas.microsoft.com/office/word/2010/wordprocessingDrawing" xmlns:wp="http://schemas.openxmlformats.org/drawingml/2006/wordprocessingDrawing" xmlns:w10="urn:schemas-microsoft-com:office:word" xmlns:w="http://schemas.openxmlformats.org/wordprocessingml/2006/main" xmlns:w14="http://schemas.microsoft.com/office/word/2010/wordml" xmlns:w15="http://schemas.microsoft.com/office/word/2012/wordml" xmlns:w16cei="http://schemas.microsoft.com/office/word/2026/wordml/cei" xmlns:w16cex="http://schemas.microsoft.com/office/word/2018/wordml/cex" xmlns:w16cid="http://schemas.microsoft.com/office/word/2016/wordml/cid" xmlns:w16="http://schemas.microsoft.com/office/word/2018/wordml" xmlns:w16du="http://schemas.microsoft.com/office/word/2023/wordml/word16du" xmlns:w16sdtdh="http://schemas.microsoft.com/office/word/2020/wordml/sdtdatahash" xmlns:w16sdtfl="http://schemas.microsoft.com/office/word/2024/wordml/sdtformatlock" xmlns:w16se="http://schemas.microsoft.com/office/word/2015/wordml/symex" xmlns:wpg="http://schemas.microsoft.com/office/word/2010/wordprocessingGroup" xmlns:wpi="http://schemas.microsoft.com/office/word/2010/wordprocessingInk" xmlns:wne="http://schemas.microsoft.com/office/word/2006/wordml" xmlns:wps="http://schemas.microsoft.com/office/word/2010/wordprocessingShape" mc:Ignorable="w14 w15 w16se w16cid w16 w16cex w16sdtdh w16sdtfl w16du wp14">
   <w:abstractNum w:abstractNumId="0" w15:restartNumberingAfterBreak="0">
     <w:nsid w:val="342B128B"/>
     <w:multiLevelType w:val="hybridMultilevel"/>
@@ -7969,6 +10095,7 @@
   <w:style w:type="paragraph" w:default="1" w:styleId="Normal">
     <w:name w:val="Normal"/>
     <w:qFormat/>
+    <w:rsid w:val="000D08F4"/>
   </w:style>
   <w:style w:type="paragraph" w:styleId="Heading1">
     <w:name w:val="heading 1"/>

</xml_diff>